<commit_message>
docs: added repo layer architecture in Riverpod
</commit_message>
<xml_diff>
--- a/python/p5_part_2_of_oop_of_python.docx
+++ b/python/p5_part_2_of_oop_of_python.docx
@@ -42,7 +42,23 @@
           <w:sz w:val="32"/>
           <w:szCs w:val="32"/>
         </w:rPr>
-        <w:t>Composition (DI) in Python……………………………………</w:t>
+        <w:t>Composition in Python………………</w:t>
+      </w:r>
+      <w:r>
+        <w:rPr>
+          <w:rFonts w:cs="Carlito"/>
+          <w:sz w:val="32"/>
+          <w:szCs w:val="32"/>
+        </w:rPr>
+        <w:t>……</w:t>
+      </w:r>
+      <w:r>
+        <w:rPr>
+          <w:rFonts w:cs="Carlito"/>
+          <w:sz w:val="32"/>
+          <w:szCs w:val="32"/>
+        </w:rPr>
+        <w:t>……………………</w:t>
       </w:r>
       <w:proofErr w:type="gramStart"/>
       <w:r>
@@ -603,7 +619,39 @@
           <w:sz w:val="32"/>
           <w:szCs w:val="32"/>
         </w:rPr>
-        <w:t>Strategy Pattern in Python…………………………………………</w:t>
+        <w:t>Strategy Pattern</w:t>
+      </w:r>
+      <w:r>
+        <w:rPr>
+          <w:rFonts w:cs="Carlito"/>
+          <w:sz w:val="32"/>
+          <w:szCs w:val="32"/>
+        </w:rPr>
+        <w:t xml:space="preserve"> (Swappable)</w:t>
+      </w:r>
+      <w:r>
+        <w:rPr>
+          <w:rFonts w:cs="Carlito"/>
+          <w:sz w:val="32"/>
+          <w:szCs w:val="32"/>
+        </w:rPr>
+        <w:t xml:space="preserve"> in Pytho</w:t>
+      </w:r>
+      <w:r>
+        <w:rPr>
+          <w:rFonts w:cs="Carlito"/>
+          <w:sz w:val="32"/>
+          <w:szCs w:val="32"/>
+        </w:rPr>
+        <w:t>n</w:t>
+      </w:r>
+      <w:r>
+        <w:rPr>
+          <w:rFonts w:cs="Carlito"/>
+          <w:sz w:val="32"/>
+          <w:szCs w:val="32"/>
+        </w:rPr>
+        <w:t>………………………</w:t>
       </w:r>
       <w:r>
         <w:rPr>
@@ -663,6 +711,39 @@
     </w:p>
     <w:p>
       <w:pPr>
+        <w:pStyle w:val="ListParagraph"/>
+        <w:numPr>
+          <w:ilvl w:val="0"/>
+          <w:numId w:val="3"/>
+        </w:numPr>
+        <w:jc w:val="both"/>
+        <w:rPr>
+          <w:rFonts w:cs="Carlito"/>
+          <w:sz w:val="32"/>
+          <w:szCs w:val="32"/>
+        </w:rPr>
+      </w:pPr>
+      <w:r>
+        <w:rPr>
+          <w:rFonts w:cs="Carlito"/>
+          <w:sz w:val="32"/>
+          <w:szCs w:val="32"/>
+        </w:rPr>
+        <w:t>DI Pattern (Dependency Injection) in Python………………</w:t>
+      </w:r>
+      <w:proofErr w:type="gramStart"/>
+      <w:r>
+        <w:rPr>
+          <w:rFonts w:cs="Carlito"/>
+          <w:sz w:val="32"/>
+          <w:szCs w:val="32"/>
+        </w:rPr>
+        <w:t>…..</w:t>
+      </w:r>
+      <w:proofErr w:type="gramEnd"/>
+    </w:p>
+    <w:p>
+      <w:pPr>
         <w:jc w:val="both"/>
         <w:rPr>
           <w:rFonts w:cs="Carlito"/>
@@ -1735,7 +1816,23 @@
           <w:sz w:val="32"/>
           <w:szCs w:val="32"/>
         </w:rPr>
-        <w:t>Use Case of Composition (MOST IMPORTANT):</w:t>
+        <w:t>Use Case of Composition</w:t>
+      </w:r>
+      <w:r>
+        <w:rPr>
+          <w:rFonts w:cs="Carlito"/>
+          <w:sz w:val="32"/>
+          <w:szCs w:val="32"/>
+        </w:rPr>
+        <w:t xml:space="preserve"> with DI</w:t>
+      </w:r>
+      <w:r>
+        <w:rPr>
+          <w:rFonts w:cs="Carlito"/>
+          <w:sz w:val="32"/>
+          <w:szCs w:val="32"/>
+        </w:rPr>
+        <w:t xml:space="preserve"> (MOST IMPORTANT):</w:t>
       </w:r>
     </w:p>
     <w:p>
@@ -1873,10 +1970,44 @@
       <w:r>
         <w:rPr>
           <w:rFonts w:cs="Carlito"/>
-          <w:sz w:val="32"/>
-          <w:szCs w:val="32"/>
-        </w:rPr>
-        <w:t xml:space="preserve">. Very flexible and good for testing. This is called Dependency injection in </w:t>
+          <w:b/>
+          <w:bCs/>
+          <w:sz w:val="32"/>
+          <w:szCs w:val="32"/>
+        </w:rPr>
+        <w:t xml:space="preserve"> </w:t>
+      </w:r>
+      <w:r>
+        <w:rPr>
+          <w:rFonts w:cs="Carlito"/>
+          <w:sz w:val="32"/>
+          <w:szCs w:val="32"/>
+        </w:rPr>
+        <w:t>using DI Pattern (SEE BELOW)</w:t>
+      </w:r>
+      <w:r>
+        <w:rPr>
+          <w:rFonts w:cs="Carlito"/>
+          <w:sz w:val="32"/>
+          <w:szCs w:val="32"/>
+        </w:rPr>
+        <w:t>. Very flexible and good for testing. This is called Dependency injection</w:t>
+      </w:r>
+      <w:r>
+        <w:rPr>
+          <w:rFonts w:cs="Carlito"/>
+          <w:sz w:val="32"/>
+          <w:szCs w:val="32"/>
+        </w:rPr>
+        <w:t xml:space="preserve"> and interchangeability</w:t>
+      </w:r>
+      <w:r>
+        <w:rPr>
+          <w:rFonts w:cs="Carlito"/>
+          <w:sz w:val="32"/>
+          <w:szCs w:val="32"/>
+        </w:rPr>
+        <w:t xml:space="preserve"> in </w:t>
       </w:r>
       <w:r>
         <w:rPr>
@@ -2202,7 +2333,6 @@
           <w:sz w:val="32"/>
           <w:szCs w:val="32"/>
         </w:rPr>
-        <w:lastRenderedPageBreak/>
         <w:t xml:space="preserve">    def drive(self):</w:t>
       </w:r>
     </w:p>
@@ -2781,6 +2911,7 @@
           <w:sz w:val="32"/>
           <w:szCs w:val="32"/>
         </w:rPr>
+        <w:lastRenderedPageBreak/>
         <w:t xml:space="preserve">    def fly(self):</w:t>
       </w:r>
     </w:p>
@@ -2805,7 +2936,6 @@
           <w:sz w:val="32"/>
           <w:szCs w:val="32"/>
         </w:rPr>
-        <w:lastRenderedPageBreak/>
         <w:t xml:space="preserve">        print("Flying")</w:t>
       </w:r>
     </w:p>
@@ -3569,7 +3699,6 @@
           <w:sz w:val="32"/>
           <w:szCs w:val="32"/>
         </w:rPr>
-        <w:lastRenderedPageBreak/>
         <w:t>Use Cases:</w:t>
       </w:r>
     </w:p>
@@ -4111,6 +4240,7 @@
           <w:sz w:val="32"/>
           <w:szCs w:val="32"/>
         </w:rPr>
+        <w:lastRenderedPageBreak/>
         <w:t xml:space="preserve"># Without it if an exception occurs before </w:t>
       </w:r>
       <w:proofErr w:type="gramStart"/>
@@ -4165,7 +4295,6 @@
           <w:sz w:val="32"/>
           <w:szCs w:val="32"/>
         </w:rPr>
-        <w:lastRenderedPageBreak/>
         <w:t>f = open("file.txt")</w:t>
       </w:r>
     </w:p>
@@ -4877,6 +5006,7 @@
           <w:sz w:val="32"/>
           <w:szCs w:val="32"/>
         </w:rPr>
+        <w:lastRenderedPageBreak/>
         <w:t># Code:</w:t>
       </w:r>
     </w:p>
@@ -5571,6 +5701,7 @@
           <w:sz w:val="32"/>
           <w:szCs w:val="32"/>
         </w:rPr>
+        <w:lastRenderedPageBreak/>
         <w:t>Timing code execution</w:t>
       </w:r>
     </w:p>
@@ -5599,7 +5730,6 @@
           <w:sz w:val="32"/>
           <w:szCs w:val="32"/>
         </w:rPr>
-        <w:lastRenderedPageBreak/>
         <w:t>Break</w:t>
       </w:r>
     </w:p>
@@ -6357,7 +6487,6 @@
           <w:sz w:val="32"/>
           <w:szCs w:val="32"/>
         </w:rPr>
-        <w:lastRenderedPageBreak/>
         <w:t xml:space="preserve"># </w:t>
       </w:r>
       <w:r>
@@ -7201,6 +7330,7 @@
           <w:sz w:val="32"/>
           <w:szCs w:val="32"/>
         </w:rPr>
+        <w:lastRenderedPageBreak/>
         <w:t xml:space="preserve"># Operator overloading means defining what operators (+, </w:t>
       </w:r>
       <w:proofErr w:type="gramStart"/>
@@ -7261,7 +7391,6 @@
           <w:sz w:val="32"/>
           <w:szCs w:val="32"/>
         </w:rPr>
-        <w:lastRenderedPageBreak/>
         <w:t># Python calls:</w:t>
       </w:r>
     </w:p>
@@ -8270,6 +8399,7 @@
                 <w:sz w:val="32"/>
                 <w:szCs w:val="32"/>
               </w:rPr>
+              <w:lastRenderedPageBreak/>
               <w:t>/</w:t>
             </w:r>
           </w:p>
@@ -8560,7 +8690,6 @@
                 <w:sz w:val="32"/>
                 <w:szCs w:val="32"/>
               </w:rPr>
-              <w:lastRenderedPageBreak/>
               <w:t>&gt;</w:t>
             </w:r>
           </w:p>
@@ -9220,6 +9349,7 @@
           <w:sz w:val="32"/>
           <w:szCs w:val="32"/>
         </w:rPr>
+        <w:lastRenderedPageBreak/>
         <w:t xml:space="preserve">        return </w:t>
       </w:r>
       <w:proofErr w:type="spellStart"/>
@@ -9281,7 +9411,6 @@
           <w:sz w:val="32"/>
           <w:szCs w:val="32"/>
         </w:rPr>
-        <w:lastRenderedPageBreak/>
         <w:t xml:space="preserve">m = </w:t>
       </w:r>
       <w:proofErr w:type="spellStart"/>
@@ -10100,6 +10229,7 @@
           <w:sz w:val="32"/>
           <w:szCs w:val="32"/>
         </w:rPr>
+        <w:lastRenderedPageBreak/>
         <w:t xml:space="preserve">    def __</w:t>
       </w:r>
       <w:proofErr w:type="spellStart"/>
@@ -10247,7 +10377,6 @@
           <w:sz w:val="32"/>
           <w:szCs w:val="32"/>
         </w:rPr>
-        <w:lastRenderedPageBreak/>
         <w:t>my_list</w:t>
       </w:r>
       <w:proofErr w:type="spellEnd"/>
@@ -11307,6 +11436,7 @@
           <w:sz w:val="32"/>
           <w:szCs w:val="32"/>
         </w:rPr>
+        <w:lastRenderedPageBreak/>
         <w:t># A Singleton ensures that only one object of a class exists throughout the entire application</w:t>
       </w:r>
     </w:p>
@@ -11781,6 +11911,7 @@
           <w:sz w:val="32"/>
           <w:szCs w:val="32"/>
         </w:rPr>
+        <w:lastRenderedPageBreak/>
         <w:t xml:space="preserve">db1 = </w:t>
       </w:r>
       <w:proofErr w:type="gramStart"/>
@@ -11829,7 +11960,6 @@
           <w:sz w:val="32"/>
           <w:szCs w:val="32"/>
         </w:rPr>
-        <w:lastRenderedPageBreak/>
         <w:t xml:space="preserve">db2 = </w:t>
       </w:r>
       <w:proofErr w:type="gramStart"/>
@@ -12743,6 +12873,7 @@
           <w:sz w:val="32"/>
           <w:szCs w:val="32"/>
         </w:rPr>
+        <w:lastRenderedPageBreak/>
         <w:t>print(</w:t>
       </w:r>
       <w:proofErr w:type="gramEnd"/>
@@ -13226,6 +13357,7 @@
           <w:sz w:val="32"/>
           <w:szCs w:val="32"/>
         </w:rPr>
+        <w:lastRenderedPageBreak/>
         <w:t xml:space="preserve"># Like if we want to pay through </w:t>
       </w:r>
       <w:proofErr w:type="spellStart"/>
@@ -13280,7 +13412,6 @@
           <w:sz w:val="32"/>
           <w:szCs w:val="32"/>
         </w:rPr>
-        <w:lastRenderedPageBreak/>
         <w:t xml:space="preserve">class </w:t>
       </w:r>
       <w:proofErr w:type="spellStart"/>
@@ -14097,6 +14228,7 @@
           <w:sz w:val="32"/>
           <w:szCs w:val="32"/>
         </w:rPr>
+        <w:lastRenderedPageBreak/>
         <w:t xml:space="preserve">        </w:t>
       </w:r>
       <w:proofErr w:type="gramStart"/>
@@ -14169,7 +14301,6 @@
           <w:sz w:val="32"/>
           <w:szCs w:val="32"/>
         </w:rPr>
-        <w:lastRenderedPageBreak/>
         <w:t xml:space="preserve">class </w:t>
       </w:r>
       <w:proofErr w:type="spellStart"/>
@@ -15045,6 +15176,7 @@
           <w:sz w:val="32"/>
           <w:szCs w:val="32"/>
         </w:rPr>
+        <w:lastRenderedPageBreak/>
         <w:t>which chef</w:t>
       </w:r>
     </w:p>
@@ -15086,7 +15218,6 @@
           <w:sz w:val="32"/>
           <w:szCs w:val="32"/>
         </w:rPr>
-        <w:lastRenderedPageBreak/>
         <w:t># The kitchen is the factory.</w:t>
       </w:r>
     </w:p>
@@ -15758,6 +15889,7 @@
           <w:sz w:val="32"/>
           <w:szCs w:val="32"/>
         </w:rPr>
+        <w:lastRenderedPageBreak/>
         <w:t>// Using factory</w:t>
       </w:r>
     </w:p>
@@ -15782,7 +15914,6 @@
           <w:sz w:val="32"/>
           <w:szCs w:val="32"/>
         </w:rPr>
-        <w:lastRenderedPageBreak/>
         <w:t xml:space="preserve">final </w:t>
       </w:r>
       <w:proofErr w:type="spellStart"/>
@@ -16242,6 +16373,7 @@
           <w:sz w:val="32"/>
           <w:szCs w:val="32"/>
         </w:rPr>
+        <w:lastRenderedPageBreak/>
         <w:t xml:space="preserve"># Basically, abstract interfacing interchangeable pattern in </w:t>
       </w:r>
       <w:r>
@@ -16280,16 +16412,7 @@
           <w:sz w:val="32"/>
           <w:szCs w:val="32"/>
         </w:rPr>
-        <w:t xml:space="preserve">) where underlying </w:t>
-      </w:r>
-      <w:r>
-        <w:rPr>
-          <w:rFonts w:cs="Carlito"/>
-          <w:sz w:val="32"/>
-          <w:szCs w:val="32"/>
-        </w:rPr>
-        <w:lastRenderedPageBreak/>
-        <w:t>mechanisms (</w:t>
+        <w:t>) where underlying mechanisms (</w:t>
       </w:r>
       <w:proofErr w:type="spellStart"/>
       <w:r>
@@ -16933,6 +17056,7 @@
           <w:sz w:val="28"/>
           <w:szCs w:val="28"/>
         </w:rPr>
+        <w:lastRenderedPageBreak/>
         <w:t xml:space="preserve">          /      |      \</w:t>
       </w:r>
     </w:p>
@@ -16978,7 +17102,6 @@
           <w:sz w:val="28"/>
           <w:szCs w:val="28"/>
         </w:rPr>
-        <w:lastRenderedPageBreak/>
         <w:t>Bkash</w:t>
       </w:r>
       <w:proofErr w:type="spellEnd"/>
@@ -17871,7 +17994,6 @@
           <w:sz w:val="32"/>
           <w:szCs w:val="32"/>
         </w:rPr>
-        <w:lastRenderedPageBreak/>
         <w:t xml:space="preserve">        </w:t>
       </w:r>
       <w:proofErr w:type="spellStart"/>
@@ -18568,6 +18690,7 @@
           <w:sz w:val="32"/>
           <w:szCs w:val="32"/>
         </w:rPr>
+        <w:lastRenderedPageBreak/>
         <w:t>File storage (AWS S3, Local, Azure Blob)</w:t>
       </w:r>
     </w:p>
@@ -18969,7 +19092,7 @@
           <w:b/>
           <w:bCs/>
         </w:rPr>
-        <w:t xml:space="preserve">   Decorator</w:t>
+        <w:t>Decorator</w:t>
       </w:r>
     </w:p>
     <w:p>
@@ -19041,8 +19164,2429 @@
           <w:b/>
           <w:bCs/>
         </w:rPr>
-        <w:t xml:space="preserve">     Result</w:t>
-      </w:r>
+        <w:t>Result</w:t>
+      </w:r>
+    </w:p>
+    <w:p>
+      <w:pPr>
+        <w:jc w:val="both"/>
+        <w:rPr>
+          <w:rFonts w:cs="Carlito"/>
+          <w:sz w:val="32"/>
+          <w:szCs w:val="32"/>
+        </w:rPr>
+      </w:pPr>
+    </w:p>
+    <w:p>
+      <w:pPr>
+        <w:jc w:val="both"/>
+        <w:rPr>
+          <w:rFonts w:cs="Carlito"/>
+          <w:sz w:val="32"/>
+          <w:szCs w:val="32"/>
+        </w:rPr>
+      </w:pPr>
+    </w:p>
+    <w:p>
+      <w:pPr>
+        <w:jc w:val="both"/>
+        <w:rPr>
+          <w:rFonts w:cs="Carlito"/>
+          <w:sz w:val="32"/>
+          <w:szCs w:val="32"/>
+        </w:rPr>
+      </w:pPr>
+      <w:r>
+        <w:rPr>
+          <w:rFonts w:cs="Carlito"/>
+          <w:sz w:val="32"/>
+          <w:szCs w:val="32"/>
+        </w:rPr>
+        <w:t>Basic Example:</w:t>
+      </w:r>
+    </w:p>
+    <w:p>
+      <w:pPr>
+        <w:jc w:val="both"/>
+        <w:rPr>
+          <w:rFonts w:cs="Carlito"/>
+          <w:sz w:val="32"/>
+          <w:szCs w:val="32"/>
+        </w:rPr>
+      </w:pPr>
+      <w:r>
+        <w:rPr>
+          <w:rFonts w:cs="Carlito"/>
+          <w:sz w:val="32"/>
+          <w:szCs w:val="32"/>
+        </w:rPr>
+        <w:t xml:space="preserve"># </w:t>
+      </w:r>
+      <w:r>
+        <w:rPr>
+          <w:rFonts w:cs="Carlito"/>
+          <w:sz w:val="32"/>
+          <w:szCs w:val="32"/>
+        </w:rPr>
+        <w:t>Suppose we have</w:t>
+      </w:r>
+      <w:r>
+        <w:rPr>
+          <w:rFonts w:cs="Carlito"/>
+          <w:sz w:val="32"/>
+          <w:szCs w:val="32"/>
+        </w:rPr>
+        <w:t xml:space="preserve"> </w:t>
+      </w:r>
+      <w:r>
+        <w:rPr>
+          <w:rFonts w:cs="Carlito"/>
+          <w:b/>
+          <w:bCs/>
+          <w:sz w:val="32"/>
+          <w:szCs w:val="32"/>
+        </w:rPr>
+        <w:t>Coffee</w:t>
+      </w:r>
+      <w:r>
+        <w:rPr>
+          <w:rFonts w:cs="Carlito"/>
+          <w:sz w:val="32"/>
+          <w:szCs w:val="32"/>
+        </w:rPr>
+        <w:t xml:space="preserve"> class and we want to add </w:t>
+      </w:r>
+      <w:r>
+        <w:rPr>
+          <w:rFonts w:cs="Carlito"/>
+          <w:sz w:val="32"/>
+          <w:szCs w:val="32"/>
+        </w:rPr>
+        <w:t>milk (</w:t>
+      </w:r>
+      <w:proofErr w:type="spellStart"/>
+      <w:r>
+        <w:rPr>
+          <w:rFonts w:cs="Carlito"/>
+          <w:b/>
+          <w:bCs/>
+          <w:sz w:val="32"/>
+          <w:szCs w:val="32"/>
+        </w:rPr>
+        <w:t>MilkDecorator</w:t>
+      </w:r>
+      <w:proofErr w:type="spellEnd"/>
+      <w:r>
+        <w:rPr>
+          <w:rFonts w:cs="Carlito"/>
+          <w:sz w:val="32"/>
+          <w:szCs w:val="32"/>
+        </w:rPr>
+        <w:t xml:space="preserve">) instead of modifying </w:t>
+      </w:r>
+      <w:r>
+        <w:rPr>
+          <w:rFonts w:cs="Carlito"/>
+          <w:b/>
+          <w:bCs/>
+          <w:sz w:val="32"/>
+          <w:szCs w:val="32"/>
+        </w:rPr>
+        <w:t>Coffee</w:t>
+      </w:r>
+    </w:p>
+    <w:p>
+      <w:pPr>
+        <w:jc w:val="both"/>
+        <w:rPr>
+          <w:rFonts w:cs="Carlito"/>
+          <w:b/>
+          <w:bCs/>
+          <w:color w:val="D86DCB" w:themeColor="accent5" w:themeTint="99"/>
+          <w:sz w:val="32"/>
+          <w:szCs w:val="32"/>
+        </w:rPr>
+      </w:pPr>
+      <w:r>
+        <w:rPr>
+          <w:rFonts w:cs="Carlito"/>
+          <w:b/>
+          <w:bCs/>
+          <w:color w:val="D86DCB" w:themeColor="accent5" w:themeTint="99"/>
+          <w:sz w:val="32"/>
+          <w:szCs w:val="32"/>
+        </w:rPr>
+        <w:t>class Coffee:</w:t>
+      </w:r>
+    </w:p>
+    <w:p>
+      <w:pPr>
+        <w:jc w:val="both"/>
+        <w:rPr>
+          <w:rFonts w:cs="Carlito"/>
+          <w:b/>
+          <w:bCs/>
+          <w:color w:val="D86DCB" w:themeColor="accent5" w:themeTint="99"/>
+          <w:sz w:val="32"/>
+          <w:szCs w:val="32"/>
+        </w:rPr>
+      </w:pPr>
+      <w:r>
+        <w:rPr>
+          <w:rFonts w:cs="Carlito"/>
+          <w:b/>
+          <w:bCs/>
+          <w:color w:val="D86DCB" w:themeColor="accent5" w:themeTint="99"/>
+          <w:sz w:val="32"/>
+          <w:szCs w:val="32"/>
+        </w:rPr>
+        <w:t xml:space="preserve">    def cost(self):</w:t>
+      </w:r>
+    </w:p>
+    <w:p>
+      <w:pPr>
+        <w:jc w:val="both"/>
+        <w:rPr>
+          <w:rFonts w:cs="Carlito"/>
+          <w:b/>
+          <w:bCs/>
+          <w:color w:val="D86DCB" w:themeColor="accent5" w:themeTint="99"/>
+          <w:sz w:val="32"/>
+          <w:szCs w:val="32"/>
+        </w:rPr>
+      </w:pPr>
+      <w:r>
+        <w:rPr>
+          <w:rFonts w:cs="Carlito"/>
+          <w:b/>
+          <w:bCs/>
+          <w:color w:val="D86DCB" w:themeColor="accent5" w:themeTint="99"/>
+          <w:sz w:val="32"/>
+          <w:szCs w:val="32"/>
+        </w:rPr>
+        <w:t xml:space="preserve">        return 100</w:t>
+      </w:r>
+    </w:p>
+    <w:p>
+      <w:pPr>
+        <w:jc w:val="both"/>
+        <w:rPr>
+          <w:rFonts w:cs="Carlito"/>
+          <w:b/>
+          <w:bCs/>
+          <w:color w:val="D86DCB" w:themeColor="accent5" w:themeTint="99"/>
+          <w:sz w:val="32"/>
+          <w:szCs w:val="32"/>
+        </w:rPr>
+      </w:pPr>
+    </w:p>
+    <w:p>
+      <w:pPr>
+        <w:jc w:val="both"/>
+        <w:rPr>
+          <w:rFonts w:cs="Carlito"/>
+          <w:b/>
+          <w:bCs/>
+          <w:color w:val="D86DCB" w:themeColor="accent5" w:themeTint="99"/>
+          <w:sz w:val="32"/>
+          <w:szCs w:val="32"/>
+        </w:rPr>
+      </w:pPr>
+      <w:r>
+        <w:rPr>
+          <w:rFonts w:cs="Carlito"/>
+          <w:b/>
+          <w:bCs/>
+          <w:color w:val="D86DCB" w:themeColor="accent5" w:themeTint="99"/>
+          <w:sz w:val="32"/>
+          <w:szCs w:val="32"/>
+        </w:rPr>
+        <w:t xml:space="preserve">class </w:t>
+      </w:r>
+      <w:proofErr w:type="spellStart"/>
+      <w:r>
+        <w:rPr>
+          <w:rFonts w:cs="Carlito"/>
+          <w:b/>
+          <w:bCs/>
+          <w:color w:val="D86DCB" w:themeColor="accent5" w:themeTint="99"/>
+          <w:sz w:val="32"/>
+          <w:szCs w:val="32"/>
+        </w:rPr>
+        <w:t>MilkDecorator</w:t>
+      </w:r>
+      <w:proofErr w:type="spellEnd"/>
+      <w:r>
+        <w:rPr>
+          <w:rFonts w:cs="Carlito"/>
+          <w:b/>
+          <w:bCs/>
+          <w:color w:val="D86DCB" w:themeColor="accent5" w:themeTint="99"/>
+          <w:sz w:val="32"/>
+          <w:szCs w:val="32"/>
+        </w:rPr>
+        <w:t>:</w:t>
+      </w:r>
+    </w:p>
+    <w:p>
+      <w:pPr>
+        <w:jc w:val="both"/>
+        <w:rPr>
+          <w:rFonts w:cs="Carlito"/>
+          <w:b/>
+          <w:bCs/>
+          <w:color w:val="D86DCB" w:themeColor="accent5" w:themeTint="99"/>
+          <w:sz w:val="32"/>
+          <w:szCs w:val="32"/>
+        </w:rPr>
+      </w:pPr>
+      <w:r>
+        <w:rPr>
+          <w:rFonts w:cs="Carlito"/>
+          <w:b/>
+          <w:bCs/>
+          <w:color w:val="D86DCB" w:themeColor="accent5" w:themeTint="99"/>
+          <w:sz w:val="32"/>
+          <w:szCs w:val="32"/>
+        </w:rPr>
+        <w:t xml:space="preserve">    def __</w:t>
+      </w:r>
+      <w:proofErr w:type="spellStart"/>
+      <w:r>
+        <w:rPr>
+          <w:rFonts w:cs="Carlito"/>
+          <w:b/>
+          <w:bCs/>
+          <w:color w:val="D86DCB" w:themeColor="accent5" w:themeTint="99"/>
+          <w:sz w:val="32"/>
+          <w:szCs w:val="32"/>
+        </w:rPr>
+        <w:t>init</w:t>
+      </w:r>
+      <w:proofErr w:type="spellEnd"/>
+      <w:r>
+        <w:rPr>
+          <w:rFonts w:cs="Carlito"/>
+          <w:b/>
+          <w:bCs/>
+          <w:color w:val="D86DCB" w:themeColor="accent5" w:themeTint="99"/>
+          <w:sz w:val="32"/>
+          <w:szCs w:val="32"/>
+        </w:rPr>
+        <w:t>_</w:t>
+      </w:r>
+      <w:proofErr w:type="gramStart"/>
+      <w:r>
+        <w:rPr>
+          <w:rFonts w:cs="Carlito"/>
+          <w:b/>
+          <w:bCs/>
+          <w:color w:val="D86DCB" w:themeColor="accent5" w:themeTint="99"/>
+          <w:sz w:val="32"/>
+          <w:szCs w:val="32"/>
+        </w:rPr>
+        <w:t>_(</w:t>
+      </w:r>
+      <w:proofErr w:type="gramEnd"/>
+      <w:r>
+        <w:rPr>
+          <w:rFonts w:cs="Carlito"/>
+          <w:b/>
+          <w:bCs/>
+          <w:color w:val="D86DCB" w:themeColor="accent5" w:themeTint="99"/>
+          <w:sz w:val="32"/>
+          <w:szCs w:val="32"/>
+        </w:rPr>
+        <w:t>self, coffee):</w:t>
+      </w:r>
+    </w:p>
+    <w:p>
+      <w:pPr>
+        <w:jc w:val="both"/>
+        <w:rPr>
+          <w:rFonts w:cs="Carlito"/>
+          <w:b/>
+          <w:bCs/>
+          <w:color w:val="D86DCB" w:themeColor="accent5" w:themeTint="99"/>
+          <w:sz w:val="32"/>
+          <w:szCs w:val="32"/>
+        </w:rPr>
+      </w:pPr>
+      <w:r>
+        <w:rPr>
+          <w:rFonts w:cs="Carlito"/>
+          <w:b/>
+          <w:bCs/>
+          <w:color w:val="D86DCB" w:themeColor="accent5" w:themeTint="99"/>
+          <w:sz w:val="32"/>
+          <w:szCs w:val="32"/>
+        </w:rPr>
+        <w:t xml:space="preserve">        </w:t>
+      </w:r>
+      <w:proofErr w:type="spellStart"/>
+      <w:proofErr w:type="gramStart"/>
+      <w:r>
+        <w:rPr>
+          <w:rFonts w:cs="Carlito"/>
+          <w:b/>
+          <w:bCs/>
+          <w:color w:val="D86DCB" w:themeColor="accent5" w:themeTint="99"/>
+          <w:sz w:val="32"/>
+          <w:szCs w:val="32"/>
+        </w:rPr>
+        <w:t>self.coffee</w:t>
+      </w:r>
+      <w:proofErr w:type="spellEnd"/>
+      <w:proofErr w:type="gramEnd"/>
+      <w:r>
+        <w:rPr>
+          <w:rFonts w:cs="Carlito"/>
+          <w:b/>
+          <w:bCs/>
+          <w:color w:val="D86DCB" w:themeColor="accent5" w:themeTint="99"/>
+          <w:sz w:val="32"/>
+          <w:szCs w:val="32"/>
+        </w:rPr>
+        <w:t xml:space="preserve"> = coffee</w:t>
+      </w:r>
+    </w:p>
+    <w:p>
+      <w:pPr>
+        <w:jc w:val="both"/>
+        <w:rPr>
+          <w:rFonts w:cs="Carlito"/>
+          <w:b/>
+          <w:bCs/>
+          <w:color w:val="D86DCB" w:themeColor="accent5" w:themeTint="99"/>
+          <w:sz w:val="32"/>
+          <w:szCs w:val="32"/>
+        </w:rPr>
+      </w:pPr>
+    </w:p>
+    <w:p>
+      <w:pPr>
+        <w:jc w:val="both"/>
+        <w:rPr>
+          <w:rFonts w:cs="Carlito"/>
+          <w:b/>
+          <w:bCs/>
+          <w:color w:val="D86DCB" w:themeColor="accent5" w:themeTint="99"/>
+          <w:sz w:val="32"/>
+          <w:szCs w:val="32"/>
+        </w:rPr>
+      </w:pPr>
+      <w:r>
+        <w:rPr>
+          <w:rFonts w:cs="Carlito"/>
+          <w:b/>
+          <w:bCs/>
+          <w:color w:val="D86DCB" w:themeColor="accent5" w:themeTint="99"/>
+          <w:sz w:val="32"/>
+          <w:szCs w:val="32"/>
+        </w:rPr>
+        <w:t xml:space="preserve">    def cost(self):</w:t>
+      </w:r>
+    </w:p>
+    <w:p>
+      <w:pPr>
+        <w:jc w:val="both"/>
+        <w:rPr>
+          <w:rFonts w:cs="Carlito"/>
+          <w:b/>
+          <w:bCs/>
+          <w:color w:val="D86DCB" w:themeColor="accent5" w:themeTint="99"/>
+          <w:sz w:val="32"/>
+          <w:szCs w:val="32"/>
+        </w:rPr>
+      </w:pPr>
+      <w:r>
+        <w:rPr>
+          <w:rFonts w:cs="Carlito"/>
+          <w:b/>
+          <w:bCs/>
+          <w:color w:val="D86DCB" w:themeColor="accent5" w:themeTint="99"/>
+          <w:sz w:val="32"/>
+          <w:szCs w:val="32"/>
+        </w:rPr>
+        <w:t xml:space="preserve">        return </w:t>
+      </w:r>
+      <w:proofErr w:type="spellStart"/>
+      <w:proofErr w:type="gramStart"/>
+      <w:r>
+        <w:rPr>
+          <w:rFonts w:cs="Carlito"/>
+          <w:b/>
+          <w:bCs/>
+          <w:color w:val="D86DCB" w:themeColor="accent5" w:themeTint="99"/>
+          <w:sz w:val="32"/>
+          <w:szCs w:val="32"/>
+        </w:rPr>
+        <w:t>self.coffee</w:t>
+      </w:r>
+      <w:proofErr w:type="gramEnd"/>
+      <w:r>
+        <w:rPr>
+          <w:rFonts w:cs="Carlito"/>
+          <w:b/>
+          <w:bCs/>
+          <w:color w:val="D86DCB" w:themeColor="accent5" w:themeTint="99"/>
+          <w:sz w:val="32"/>
+          <w:szCs w:val="32"/>
+        </w:rPr>
+        <w:t>.cost</w:t>
+      </w:r>
+      <w:proofErr w:type="spellEnd"/>
+      <w:r>
+        <w:rPr>
+          <w:rFonts w:cs="Carlito"/>
+          <w:b/>
+          <w:bCs/>
+          <w:color w:val="D86DCB" w:themeColor="accent5" w:themeTint="99"/>
+          <w:sz w:val="32"/>
+          <w:szCs w:val="32"/>
+        </w:rPr>
+        <w:t>() + 30</w:t>
+      </w:r>
+    </w:p>
+    <w:p>
+      <w:pPr>
+        <w:jc w:val="both"/>
+        <w:rPr>
+          <w:rFonts w:cs="Carlito"/>
+          <w:sz w:val="32"/>
+          <w:szCs w:val="32"/>
+        </w:rPr>
+      </w:pPr>
+      <w:r>
+        <w:rPr>
+          <w:rFonts w:cs="Carlito"/>
+          <w:sz w:val="32"/>
+          <w:szCs w:val="32"/>
+        </w:rPr>
+        <w:t># Use it like this:</w:t>
+      </w:r>
+    </w:p>
+    <w:p>
+      <w:pPr>
+        <w:jc w:val="both"/>
+        <w:rPr>
+          <w:rFonts w:cs="Carlito"/>
+          <w:b/>
+          <w:bCs/>
+          <w:color w:val="D86DCB" w:themeColor="accent5" w:themeTint="99"/>
+          <w:sz w:val="32"/>
+          <w:szCs w:val="32"/>
+        </w:rPr>
+      </w:pPr>
+      <w:r>
+        <w:rPr>
+          <w:rFonts w:cs="Carlito"/>
+          <w:b/>
+          <w:bCs/>
+          <w:color w:val="D86DCB" w:themeColor="accent5" w:themeTint="99"/>
+          <w:sz w:val="32"/>
+          <w:szCs w:val="32"/>
+        </w:rPr>
+        <w:t xml:space="preserve">coffee = </w:t>
+      </w:r>
+      <w:proofErr w:type="gramStart"/>
+      <w:r>
+        <w:rPr>
+          <w:rFonts w:cs="Carlito"/>
+          <w:b/>
+          <w:bCs/>
+          <w:color w:val="D86DCB" w:themeColor="accent5" w:themeTint="99"/>
+          <w:sz w:val="32"/>
+          <w:szCs w:val="32"/>
+        </w:rPr>
+        <w:t>Coffee(</w:t>
+      </w:r>
+      <w:proofErr w:type="gramEnd"/>
+      <w:r>
+        <w:rPr>
+          <w:rFonts w:cs="Carlito"/>
+          <w:b/>
+          <w:bCs/>
+          <w:color w:val="D86DCB" w:themeColor="accent5" w:themeTint="99"/>
+          <w:sz w:val="32"/>
+          <w:szCs w:val="32"/>
+        </w:rPr>
+        <w:t>)</w:t>
+      </w:r>
+    </w:p>
+    <w:p>
+      <w:pPr>
+        <w:jc w:val="both"/>
+        <w:rPr>
+          <w:rFonts w:cs="Carlito"/>
+          <w:b/>
+          <w:bCs/>
+          <w:color w:val="D86DCB" w:themeColor="accent5" w:themeTint="99"/>
+          <w:sz w:val="32"/>
+          <w:szCs w:val="32"/>
+        </w:rPr>
+      </w:pPr>
+    </w:p>
+    <w:p>
+      <w:pPr>
+        <w:jc w:val="both"/>
+        <w:rPr>
+          <w:rFonts w:cs="Carlito"/>
+          <w:b/>
+          <w:bCs/>
+          <w:color w:val="D86DCB" w:themeColor="accent5" w:themeTint="99"/>
+          <w:sz w:val="32"/>
+          <w:szCs w:val="32"/>
+        </w:rPr>
+      </w:pPr>
+      <w:proofErr w:type="spellStart"/>
+      <w:r>
+        <w:rPr>
+          <w:rFonts w:cs="Carlito"/>
+          <w:b/>
+          <w:bCs/>
+          <w:color w:val="D86DCB" w:themeColor="accent5" w:themeTint="99"/>
+          <w:sz w:val="32"/>
+          <w:szCs w:val="32"/>
+        </w:rPr>
+        <w:t>coffee_with_milk</w:t>
+      </w:r>
+      <w:proofErr w:type="spellEnd"/>
+      <w:r>
+        <w:rPr>
+          <w:rFonts w:cs="Carlito"/>
+          <w:b/>
+          <w:bCs/>
+          <w:color w:val="D86DCB" w:themeColor="accent5" w:themeTint="99"/>
+          <w:sz w:val="32"/>
+          <w:szCs w:val="32"/>
+        </w:rPr>
+        <w:t xml:space="preserve"> = </w:t>
+      </w:r>
+      <w:proofErr w:type="spellStart"/>
+      <w:r>
+        <w:rPr>
+          <w:rFonts w:cs="Carlito"/>
+          <w:b/>
+          <w:bCs/>
+          <w:color w:val="D86DCB" w:themeColor="accent5" w:themeTint="99"/>
+          <w:sz w:val="32"/>
+          <w:szCs w:val="32"/>
+        </w:rPr>
+        <w:t>MilkDecorator</w:t>
+      </w:r>
+      <w:proofErr w:type="spellEnd"/>
+      <w:r>
+        <w:rPr>
+          <w:rFonts w:cs="Carlito"/>
+          <w:b/>
+          <w:bCs/>
+          <w:color w:val="D86DCB" w:themeColor="accent5" w:themeTint="99"/>
+          <w:sz w:val="32"/>
+          <w:szCs w:val="32"/>
+        </w:rPr>
+        <w:t>(coffee)</w:t>
+      </w:r>
+    </w:p>
+    <w:p>
+      <w:pPr>
+        <w:jc w:val="both"/>
+        <w:rPr>
+          <w:rFonts w:cs="Carlito"/>
+          <w:b/>
+          <w:bCs/>
+          <w:color w:val="D86DCB" w:themeColor="accent5" w:themeTint="99"/>
+          <w:sz w:val="32"/>
+          <w:szCs w:val="32"/>
+        </w:rPr>
+      </w:pPr>
+      <w:r>
+        <w:rPr>
+          <w:rFonts w:cs="Carlito"/>
+          <w:b/>
+          <w:bCs/>
+          <w:color w:val="D86DCB" w:themeColor="accent5" w:themeTint="99"/>
+          <w:sz w:val="32"/>
+          <w:szCs w:val="32"/>
+        </w:rPr>
+        <w:t>print(</w:t>
+      </w:r>
+      <w:proofErr w:type="spellStart"/>
+      <w:r>
+        <w:rPr>
+          <w:rFonts w:cs="Carlito"/>
+          <w:b/>
+          <w:bCs/>
+          <w:color w:val="D86DCB" w:themeColor="accent5" w:themeTint="99"/>
+          <w:sz w:val="32"/>
+          <w:szCs w:val="32"/>
+        </w:rPr>
+        <w:t>coffee_with_</w:t>
+      </w:r>
+      <w:proofErr w:type="gramStart"/>
+      <w:r>
+        <w:rPr>
+          <w:rFonts w:cs="Carlito"/>
+          <w:b/>
+          <w:bCs/>
+          <w:color w:val="D86DCB" w:themeColor="accent5" w:themeTint="99"/>
+          <w:sz w:val="32"/>
+          <w:szCs w:val="32"/>
+        </w:rPr>
+        <w:t>milk.cost</w:t>
+      </w:r>
+      <w:proofErr w:type="spellEnd"/>
+      <w:proofErr w:type="gramEnd"/>
+      <w:r>
+        <w:rPr>
+          <w:rFonts w:cs="Carlito"/>
+          <w:b/>
+          <w:bCs/>
+          <w:color w:val="D86DCB" w:themeColor="accent5" w:themeTint="99"/>
+          <w:sz w:val="32"/>
+          <w:szCs w:val="32"/>
+        </w:rPr>
+        <w:t>())</w:t>
+      </w:r>
+      <w:r>
+        <w:rPr>
+          <w:rFonts w:cs="Carlito"/>
+          <w:b/>
+          <w:bCs/>
+          <w:color w:val="D86DCB" w:themeColor="accent5" w:themeTint="99"/>
+          <w:sz w:val="32"/>
+          <w:szCs w:val="32"/>
+        </w:rPr>
+        <w:t xml:space="preserve"> </w:t>
+      </w:r>
+      <w:r>
+        <w:rPr>
+          <w:rFonts w:cs="Carlito"/>
+          <w:b/>
+          <w:bCs/>
+          <w:color w:val="D86DCB" w:themeColor="accent5" w:themeTint="99"/>
+          <w:sz w:val="32"/>
+          <w:szCs w:val="32"/>
+        </w:rPr>
+        <w:t># 130</w:t>
+      </w:r>
+    </w:p>
+    <w:p>
+      <w:pPr>
+        <w:jc w:val="both"/>
+        <w:rPr>
+          <w:rFonts w:cs="Carlito"/>
+          <w:sz w:val="32"/>
+          <w:szCs w:val="32"/>
+        </w:rPr>
+      </w:pPr>
+      <w:r>
+        <w:rPr>
+          <w:rFonts w:cs="Carlito"/>
+          <w:sz w:val="32"/>
+          <w:szCs w:val="32"/>
+        </w:rPr>
+        <w:t xml:space="preserve"># </w:t>
+      </w:r>
+      <w:r>
+        <w:rPr>
+          <w:rFonts w:cs="Carlito"/>
+          <w:sz w:val="32"/>
+          <w:szCs w:val="32"/>
+        </w:rPr>
+        <w:t>Now we can stack decorators</w:t>
+      </w:r>
+      <w:r>
+        <w:rPr>
+          <w:rFonts w:cs="Carlito"/>
+          <w:sz w:val="32"/>
+          <w:szCs w:val="32"/>
+        </w:rPr>
+        <w:t xml:space="preserve"> where each decorator adds behavior while leaving </w:t>
+      </w:r>
+      <w:r>
+        <w:rPr>
+          <w:rFonts w:cs="Carlito"/>
+          <w:b/>
+          <w:bCs/>
+          <w:sz w:val="32"/>
+          <w:szCs w:val="32"/>
+        </w:rPr>
+        <w:t>Coffee</w:t>
+      </w:r>
+      <w:r>
+        <w:rPr>
+          <w:rFonts w:cs="Carlito"/>
+          <w:sz w:val="32"/>
+          <w:szCs w:val="32"/>
+        </w:rPr>
+        <w:t xml:space="preserve"> untouched</w:t>
+      </w:r>
+      <w:r>
+        <w:rPr>
+          <w:rFonts w:cs="Carlito"/>
+          <w:sz w:val="32"/>
+          <w:szCs w:val="32"/>
+        </w:rPr>
+        <w:t>:</w:t>
+      </w:r>
+    </w:p>
+    <w:p>
+      <w:pPr>
+        <w:jc w:val="both"/>
+        <w:rPr>
+          <w:rFonts w:cs="Carlito"/>
+          <w:b/>
+          <w:bCs/>
+          <w:color w:val="D86DCB" w:themeColor="accent5" w:themeTint="99"/>
+          <w:sz w:val="32"/>
+          <w:szCs w:val="32"/>
+        </w:rPr>
+      </w:pPr>
+      <w:r>
+        <w:rPr>
+          <w:rFonts w:cs="Carlito"/>
+          <w:b/>
+          <w:bCs/>
+          <w:color w:val="D86DCB" w:themeColor="accent5" w:themeTint="99"/>
+          <w:sz w:val="32"/>
+          <w:szCs w:val="32"/>
+        </w:rPr>
+        <w:t xml:space="preserve">coffee = </w:t>
+      </w:r>
+      <w:proofErr w:type="gramStart"/>
+      <w:r>
+        <w:rPr>
+          <w:rFonts w:cs="Carlito"/>
+          <w:b/>
+          <w:bCs/>
+          <w:color w:val="D86DCB" w:themeColor="accent5" w:themeTint="99"/>
+          <w:sz w:val="32"/>
+          <w:szCs w:val="32"/>
+        </w:rPr>
+        <w:t>Coffee(</w:t>
+      </w:r>
+      <w:proofErr w:type="gramEnd"/>
+      <w:r>
+        <w:rPr>
+          <w:rFonts w:cs="Carlito"/>
+          <w:b/>
+          <w:bCs/>
+          <w:color w:val="D86DCB" w:themeColor="accent5" w:themeTint="99"/>
+          <w:sz w:val="32"/>
+          <w:szCs w:val="32"/>
+        </w:rPr>
+        <w:t>)</w:t>
+      </w:r>
+    </w:p>
+    <w:p>
+      <w:pPr>
+        <w:jc w:val="both"/>
+        <w:rPr>
+          <w:rFonts w:cs="Carlito"/>
+          <w:b/>
+          <w:bCs/>
+          <w:color w:val="D86DCB" w:themeColor="accent5" w:themeTint="99"/>
+          <w:sz w:val="32"/>
+          <w:szCs w:val="32"/>
+        </w:rPr>
+      </w:pPr>
+    </w:p>
+    <w:p>
+      <w:pPr>
+        <w:jc w:val="both"/>
+        <w:rPr>
+          <w:rFonts w:cs="Carlito"/>
+          <w:b/>
+          <w:bCs/>
+          <w:color w:val="D86DCB" w:themeColor="accent5" w:themeTint="99"/>
+          <w:sz w:val="32"/>
+          <w:szCs w:val="32"/>
+        </w:rPr>
+      </w:pPr>
+      <w:proofErr w:type="spellStart"/>
+      <w:r>
+        <w:rPr>
+          <w:rFonts w:cs="Carlito"/>
+          <w:b/>
+          <w:bCs/>
+          <w:color w:val="D86DCB" w:themeColor="accent5" w:themeTint="99"/>
+          <w:sz w:val="32"/>
+          <w:szCs w:val="32"/>
+        </w:rPr>
+        <w:t>coffee</w:t>
+      </w:r>
+      <w:r>
+        <w:rPr>
+          <w:rFonts w:cs="Carlito"/>
+          <w:b/>
+          <w:bCs/>
+          <w:color w:val="D86DCB" w:themeColor="accent5" w:themeTint="99"/>
+          <w:sz w:val="32"/>
+          <w:szCs w:val="32"/>
+        </w:rPr>
+        <w:t>_with_milk</w:t>
+      </w:r>
+      <w:proofErr w:type="spellEnd"/>
+      <w:r>
+        <w:rPr>
+          <w:rFonts w:cs="Carlito"/>
+          <w:b/>
+          <w:bCs/>
+          <w:color w:val="D86DCB" w:themeColor="accent5" w:themeTint="99"/>
+          <w:sz w:val="32"/>
+          <w:szCs w:val="32"/>
+        </w:rPr>
+        <w:t xml:space="preserve"> = </w:t>
+      </w:r>
+      <w:proofErr w:type="spellStart"/>
+      <w:r>
+        <w:rPr>
+          <w:rFonts w:cs="Carlito"/>
+          <w:b/>
+          <w:bCs/>
+          <w:color w:val="D86DCB" w:themeColor="accent5" w:themeTint="99"/>
+          <w:sz w:val="32"/>
+          <w:szCs w:val="32"/>
+        </w:rPr>
+        <w:t>MilkDecorator</w:t>
+      </w:r>
+      <w:proofErr w:type="spellEnd"/>
+      <w:r>
+        <w:rPr>
+          <w:rFonts w:cs="Carlito"/>
+          <w:b/>
+          <w:bCs/>
+          <w:color w:val="D86DCB" w:themeColor="accent5" w:themeTint="99"/>
+          <w:sz w:val="32"/>
+          <w:szCs w:val="32"/>
+        </w:rPr>
+        <w:t>(coffee)</w:t>
+      </w:r>
+    </w:p>
+    <w:p>
+      <w:pPr>
+        <w:jc w:val="both"/>
+        <w:rPr>
+          <w:rFonts w:cs="Carlito"/>
+          <w:b/>
+          <w:bCs/>
+          <w:color w:val="D86DCB" w:themeColor="accent5" w:themeTint="99"/>
+          <w:sz w:val="32"/>
+          <w:szCs w:val="32"/>
+        </w:rPr>
+      </w:pPr>
+      <w:proofErr w:type="spellStart"/>
+      <w:r>
+        <w:rPr>
+          <w:rFonts w:cs="Carlito"/>
+          <w:b/>
+          <w:bCs/>
+          <w:color w:val="D86DCB" w:themeColor="accent5" w:themeTint="99"/>
+          <w:sz w:val="32"/>
+          <w:szCs w:val="32"/>
+        </w:rPr>
+        <w:t>coffee</w:t>
+      </w:r>
+      <w:r>
+        <w:rPr>
+          <w:rFonts w:cs="Carlito"/>
+          <w:b/>
+          <w:bCs/>
+          <w:color w:val="D86DCB" w:themeColor="accent5" w:themeTint="99"/>
+          <w:sz w:val="32"/>
+          <w:szCs w:val="32"/>
+        </w:rPr>
+        <w:t>_with_sugar</w:t>
+      </w:r>
+      <w:proofErr w:type="spellEnd"/>
+      <w:r>
+        <w:rPr>
+          <w:rFonts w:cs="Carlito"/>
+          <w:b/>
+          <w:bCs/>
+          <w:color w:val="D86DCB" w:themeColor="accent5" w:themeTint="99"/>
+          <w:sz w:val="32"/>
+          <w:szCs w:val="32"/>
+        </w:rPr>
+        <w:t xml:space="preserve"> = </w:t>
+      </w:r>
+      <w:proofErr w:type="spellStart"/>
+      <w:r>
+        <w:rPr>
+          <w:rFonts w:cs="Carlito"/>
+          <w:b/>
+          <w:bCs/>
+          <w:color w:val="D86DCB" w:themeColor="accent5" w:themeTint="99"/>
+          <w:sz w:val="32"/>
+          <w:szCs w:val="32"/>
+        </w:rPr>
+        <w:t>SugarDecorator</w:t>
+      </w:r>
+      <w:proofErr w:type="spellEnd"/>
+      <w:r>
+        <w:rPr>
+          <w:rFonts w:cs="Carlito"/>
+          <w:b/>
+          <w:bCs/>
+          <w:color w:val="D86DCB" w:themeColor="accent5" w:themeTint="99"/>
+          <w:sz w:val="32"/>
+          <w:szCs w:val="32"/>
+        </w:rPr>
+        <w:t>(coffee)</w:t>
+      </w:r>
+    </w:p>
+    <w:p>
+      <w:pPr>
+        <w:jc w:val="both"/>
+        <w:rPr>
+          <w:rFonts w:cs="Carlito"/>
+          <w:sz w:val="32"/>
+          <w:szCs w:val="32"/>
+        </w:rPr>
+      </w:pPr>
+    </w:p>
+    <w:p>
+      <w:pPr>
+        <w:jc w:val="both"/>
+        <w:rPr>
+          <w:rFonts w:cs="Carlito"/>
+          <w:sz w:val="32"/>
+          <w:szCs w:val="32"/>
+        </w:rPr>
+      </w:pPr>
+    </w:p>
+    <w:p>
+      <w:pPr>
+        <w:jc w:val="both"/>
+        <w:rPr>
+          <w:rFonts w:cs="Carlito"/>
+          <w:sz w:val="32"/>
+          <w:szCs w:val="32"/>
+        </w:rPr>
+      </w:pPr>
+      <w:r>
+        <w:rPr>
+          <w:rFonts w:cs="Carlito"/>
+          <w:sz w:val="32"/>
+          <w:szCs w:val="32"/>
+        </w:rPr>
+        <w:t>Importance:</w:t>
+      </w:r>
+    </w:p>
+    <w:p>
+      <w:pPr>
+        <w:jc w:val="both"/>
+        <w:rPr>
+          <w:rFonts w:cs="Carlito"/>
+          <w:sz w:val="32"/>
+          <w:szCs w:val="32"/>
+        </w:rPr>
+      </w:pPr>
+      <w:r>
+        <w:rPr>
+          <w:rFonts w:cs="Carlito"/>
+          <w:sz w:val="32"/>
+          <w:szCs w:val="32"/>
+        </w:rPr>
+        <w:t xml:space="preserve"># </w:t>
+      </w:r>
+      <w:r>
+        <w:rPr>
+          <w:rFonts w:cs="Carlito"/>
+          <w:sz w:val="32"/>
+          <w:szCs w:val="32"/>
+        </w:rPr>
+        <w:t>Imagine a service:</w:t>
+      </w:r>
+    </w:p>
+    <w:p>
+      <w:pPr>
+        <w:jc w:val="both"/>
+        <w:rPr>
+          <w:rFonts w:cs="Carlito"/>
+          <w:b/>
+          <w:bCs/>
+          <w:color w:val="D86DCB" w:themeColor="accent5" w:themeTint="99"/>
+          <w:sz w:val="32"/>
+          <w:szCs w:val="32"/>
+        </w:rPr>
+      </w:pPr>
+      <w:proofErr w:type="spellStart"/>
+      <w:proofErr w:type="gramStart"/>
+      <w:r>
+        <w:rPr>
+          <w:rFonts w:cs="Carlito"/>
+          <w:b/>
+          <w:bCs/>
+          <w:color w:val="D86DCB" w:themeColor="accent5" w:themeTint="99"/>
+          <w:sz w:val="32"/>
+          <w:szCs w:val="32"/>
+        </w:rPr>
+        <w:t>payment.pay</w:t>
+      </w:r>
+      <w:proofErr w:type="spellEnd"/>
+      <w:r>
+        <w:rPr>
+          <w:rFonts w:cs="Carlito"/>
+          <w:b/>
+          <w:bCs/>
+          <w:color w:val="D86DCB" w:themeColor="accent5" w:themeTint="99"/>
+          <w:sz w:val="32"/>
+          <w:szCs w:val="32"/>
+        </w:rPr>
+        <w:t>(</w:t>
+      </w:r>
+      <w:proofErr w:type="gramEnd"/>
+      <w:r>
+        <w:rPr>
+          <w:rFonts w:cs="Carlito"/>
+          <w:b/>
+          <w:bCs/>
+          <w:color w:val="D86DCB" w:themeColor="accent5" w:themeTint="99"/>
+          <w:sz w:val="32"/>
+          <w:szCs w:val="32"/>
+        </w:rPr>
+        <w:t>)</w:t>
+      </w:r>
+    </w:p>
+    <w:p>
+      <w:pPr>
+        <w:jc w:val="both"/>
+        <w:rPr>
+          <w:rFonts w:cs="Carlito"/>
+          <w:sz w:val="32"/>
+          <w:szCs w:val="32"/>
+        </w:rPr>
+      </w:pPr>
+      <w:r>
+        <w:rPr>
+          <w:rFonts w:cs="Carlito"/>
+          <w:sz w:val="32"/>
+          <w:szCs w:val="32"/>
+        </w:rPr>
+        <w:t># Where we</w:t>
+      </w:r>
+      <w:r>
+        <w:rPr>
+          <w:rFonts w:cs="Carlito"/>
+          <w:sz w:val="32"/>
+          <w:szCs w:val="32"/>
+        </w:rPr>
+        <w:t xml:space="preserve"> want to add:</w:t>
+      </w:r>
+    </w:p>
+    <w:p>
+      <w:pPr>
+        <w:pStyle w:val="ListParagraph"/>
+        <w:numPr>
+          <w:ilvl w:val="0"/>
+          <w:numId w:val="17"/>
+        </w:numPr>
+        <w:jc w:val="both"/>
+        <w:rPr>
+          <w:rFonts w:cs="Carlito"/>
+          <w:sz w:val="32"/>
+          <w:szCs w:val="32"/>
+        </w:rPr>
+      </w:pPr>
+      <w:r>
+        <w:rPr>
+          <w:rFonts w:cs="Carlito"/>
+          <w:sz w:val="32"/>
+          <w:szCs w:val="32"/>
+        </w:rPr>
+        <w:t>logging</w:t>
+      </w:r>
+    </w:p>
+    <w:p>
+      <w:pPr>
+        <w:pStyle w:val="ListParagraph"/>
+        <w:numPr>
+          <w:ilvl w:val="0"/>
+          <w:numId w:val="17"/>
+        </w:numPr>
+        <w:jc w:val="both"/>
+        <w:rPr>
+          <w:rFonts w:cs="Carlito"/>
+          <w:sz w:val="32"/>
+          <w:szCs w:val="32"/>
+        </w:rPr>
+      </w:pPr>
+      <w:r>
+        <w:rPr>
+          <w:rFonts w:cs="Carlito"/>
+          <w:sz w:val="32"/>
+          <w:szCs w:val="32"/>
+        </w:rPr>
+        <w:t>caching</w:t>
+      </w:r>
+    </w:p>
+    <w:p>
+      <w:pPr>
+        <w:pStyle w:val="ListParagraph"/>
+        <w:numPr>
+          <w:ilvl w:val="0"/>
+          <w:numId w:val="17"/>
+        </w:numPr>
+        <w:jc w:val="both"/>
+        <w:rPr>
+          <w:rFonts w:cs="Carlito"/>
+          <w:sz w:val="32"/>
+          <w:szCs w:val="32"/>
+        </w:rPr>
+      </w:pPr>
+      <w:r>
+        <w:rPr>
+          <w:rFonts w:cs="Carlito"/>
+          <w:sz w:val="32"/>
+          <w:szCs w:val="32"/>
+        </w:rPr>
+        <w:t>authentication</w:t>
+      </w:r>
+      <w:r>
+        <w:rPr>
+          <w:rFonts w:cs="Carlito"/>
+          <w:sz w:val="32"/>
+          <w:szCs w:val="32"/>
+        </w:rPr>
+        <w:t xml:space="preserve">, </w:t>
+      </w:r>
+      <w:r>
+        <w:rPr>
+          <w:rFonts w:cs="Carlito"/>
+          <w:sz w:val="32"/>
+          <w:szCs w:val="32"/>
+        </w:rPr>
+        <w:t>validation</w:t>
+      </w:r>
+      <w:r>
+        <w:rPr>
+          <w:rFonts w:cs="Carlito"/>
+          <w:sz w:val="32"/>
+          <w:szCs w:val="32"/>
+        </w:rPr>
+        <w:t xml:space="preserve">, </w:t>
+      </w:r>
+      <w:r>
+        <w:rPr>
+          <w:rFonts w:cs="Carlito"/>
+          <w:sz w:val="32"/>
+          <w:szCs w:val="32"/>
+        </w:rPr>
+        <w:t>retry logic</w:t>
+      </w:r>
+      <w:r>
+        <w:rPr>
+          <w:rFonts w:cs="Carlito"/>
+          <w:sz w:val="32"/>
+          <w:szCs w:val="32"/>
+        </w:rPr>
+        <w:t xml:space="preserve"> etc.</w:t>
+      </w:r>
+    </w:p>
+    <w:p>
+      <w:pPr>
+        <w:jc w:val="both"/>
+        <w:rPr>
+          <w:rFonts w:cs="Carlito"/>
+          <w:sz w:val="32"/>
+          <w:szCs w:val="32"/>
+        </w:rPr>
+      </w:pPr>
+      <w:r>
+        <w:rPr>
+          <w:rFonts w:cs="Carlito"/>
+          <w:sz w:val="32"/>
+          <w:szCs w:val="32"/>
+        </w:rPr>
+        <w:t xml:space="preserve"># </w:t>
+      </w:r>
+      <w:r>
+        <w:rPr>
+          <w:rFonts w:cs="Carlito"/>
+          <w:sz w:val="32"/>
+          <w:szCs w:val="32"/>
+        </w:rPr>
+        <w:t xml:space="preserve">Instead of modifying </w:t>
+      </w:r>
+      <w:proofErr w:type="spellStart"/>
+      <w:r>
+        <w:rPr>
+          <w:rFonts w:cs="Carlito"/>
+          <w:b/>
+          <w:bCs/>
+          <w:sz w:val="32"/>
+          <w:szCs w:val="32"/>
+        </w:rPr>
+        <w:t>PaymentService</w:t>
+      </w:r>
+      <w:proofErr w:type="spellEnd"/>
+      <w:r>
+        <w:rPr>
+          <w:rFonts w:cs="Carlito"/>
+          <w:sz w:val="32"/>
+          <w:szCs w:val="32"/>
+        </w:rPr>
+        <w:t xml:space="preserve"> every time, </w:t>
+      </w:r>
+      <w:r>
+        <w:rPr>
+          <w:rFonts w:cs="Carlito"/>
+          <w:sz w:val="32"/>
+          <w:szCs w:val="32"/>
+        </w:rPr>
+        <w:t>we</w:t>
+      </w:r>
+      <w:r>
+        <w:rPr>
+          <w:rFonts w:cs="Carlito"/>
+          <w:sz w:val="32"/>
+          <w:szCs w:val="32"/>
+        </w:rPr>
+        <w:t xml:space="preserve"> can wrap it:</w:t>
+      </w:r>
+    </w:p>
+    <w:p>
+      <w:pPr>
+        <w:jc w:val="both"/>
+        <w:rPr>
+          <w:rFonts w:cs="Carlito"/>
+          <w:b/>
+          <w:bCs/>
+        </w:rPr>
+      </w:pPr>
+      <w:proofErr w:type="spellStart"/>
+      <w:r>
+        <w:rPr>
+          <w:rFonts w:cs="Carlito"/>
+          <w:b/>
+          <w:bCs/>
+        </w:rPr>
+        <w:t>LoggingDecorator</w:t>
+      </w:r>
+      <w:proofErr w:type="spellEnd"/>
+    </w:p>
+    <w:p>
+      <w:pPr>
+        <w:jc w:val="both"/>
+        <w:rPr>
+          <w:rFonts w:cs="Carlito"/>
+          <w:b/>
+          <w:bCs/>
+        </w:rPr>
+      </w:pPr>
+      <w:r>
+        <w:rPr>
+          <w:rFonts w:cs="Carlito"/>
+          <w:b/>
+          <w:bCs/>
+        </w:rPr>
+        <w:t xml:space="preserve">       ↓</w:t>
+      </w:r>
+    </w:p>
+    <w:p>
+      <w:pPr>
+        <w:jc w:val="both"/>
+        <w:rPr>
+          <w:rFonts w:cs="Carlito"/>
+          <w:b/>
+          <w:bCs/>
+        </w:rPr>
+      </w:pPr>
+      <w:proofErr w:type="spellStart"/>
+      <w:r>
+        <w:rPr>
+          <w:rFonts w:cs="Carlito"/>
+          <w:b/>
+          <w:bCs/>
+        </w:rPr>
+        <w:t>CachingDecorator</w:t>
+      </w:r>
+      <w:proofErr w:type="spellEnd"/>
+    </w:p>
+    <w:p>
+      <w:pPr>
+        <w:jc w:val="both"/>
+        <w:rPr>
+          <w:rFonts w:cs="Carlito"/>
+          <w:b/>
+          <w:bCs/>
+        </w:rPr>
+      </w:pPr>
+      <w:r>
+        <w:rPr>
+          <w:rFonts w:cs="Carlito"/>
+          <w:b/>
+          <w:bCs/>
+        </w:rPr>
+        <w:t xml:space="preserve">       ↓</w:t>
+      </w:r>
+    </w:p>
+    <w:p>
+      <w:pPr>
+        <w:jc w:val="both"/>
+        <w:rPr>
+          <w:rFonts w:cs="Carlito"/>
+          <w:b/>
+          <w:bCs/>
+        </w:rPr>
+      </w:pPr>
+      <w:proofErr w:type="spellStart"/>
+      <w:r>
+        <w:rPr>
+          <w:rFonts w:cs="Carlito"/>
+          <w:b/>
+          <w:bCs/>
+        </w:rPr>
+        <w:t>PaymentService</w:t>
+      </w:r>
+      <w:proofErr w:type="spellEnd"/>
+    </w:p>
+    <w:p>
+      <w:pPr>
+        <w:jc w:val="both"/>
+        <w:rPr>
+          <w:rFonts w:cs="Carlito"/>
+          <w:sz w:val="32"/>
+          <w:szCs w:val="32"/>
+        </w:rPr>
+      </w:pPr>
+      <w:r>
+        <w:rPr>
+          <w:rFonts w:cs="Carlito"/>
+          <w:sz w:val="32"/>
+          <w:szCs w:val="32"/>
+        </w:rPr>
+        <w:t xml:space="preserve"># </w:t>
+      </w:r>
+      <w:r>
+        <w:rPr>
+          <w:rFonts w:cs="Carlito"/>
+          <w:sz w:val="32"/>
+          <w:szCs w:val="32"/>
+        </w:rPr>
+        <w:t>Each layer can do something before/after delegating to the wrapped object</w:t>
+      </w:r>
+    </w:p>
+    <w:p>
+      <w:pPr>
+        <w:jc w:val="both"/>
+        <w:rPr>
+          <w:rFonts w:cs="Carlito"/>
+          <w:sz w:val="32"/>
+          <w:szCs w:val="32"/>
+        </w:rPr>
+      </w:pPr>
+    </w:p>
+    <w:p>
+      <w:pPr>
+        <w:jc w:val="both"/>
+        <w:rPr>
+          <w:rFonts w:cs="Carlito"/>
+          <w:sz w:val="32"/>
+          <w:szCs w:val="32"/>
+        </w:rPr>
+      </w:pPr>
+    </w:p>
+    <w:p>
+      <w:pPr>
+        <w:jc w:val="both"/>
+        <w:rPr>
+          <w:rFonts w:cs="Carlito"/>
+          <w:sz w:val="32"/>
+          <w:szCs w:val="32"/>
+        </w:rPr>
+      </w:pPr>
+      <w:r>
+        <w:rPr>
+          <w:rFonts w:cs="Carlito"/>
+          <w:sz w:val="32"/>
+          <w:szCs w:val="32"/>
+        </w:rPr>
+        <w:t>Decorator Pattern vs Inheritance</w:t>
+      </w:r>
+      <w:r>
+        <w:rPr>
+          <w:rFonts w:cs="Carlito"/>
+          <w:sz w:val="32"/>
+          <w:szCs w:val="32"/>
+        </w:rPr>
+        <w:t>:</w:t>
+      </w:r>
+    </w:p>
+    <w:p>
+      <w:pPr>
+        <w:jc w:val="both"/>
+        <w:rPr>
+          <w:rFonts w:cs="Carlito"/>
+          <w:sz w:val="32"/>
+          <w:szCs w:val="32"/>
+        </w:rPr>
+      </w:pPr>
+      <w:r>
+        <w:rPr>
+          <w:rFonts w:cs="Carlito"/>
+          <w:sz w:val="32"/>
+          <w:szCs w:val="32"/>
+        </w:rPr>
+        <w:lastRenderedPageBreak/>
+        <w:t xml:space="preserve"># In </w:t>
+      </w:r>
+      <w:r>
+        <w:rPr>
+          <w:rFonts w:cs="Carlito"/>
+          <w:sz w:val="32"/>
+          <w:szCs w:val="32"/>
+        </w:rPr>
+        <w:t>Inheritance</w:t>
+      </w:r>
+      <w:r>
+        <w:rPr>
+          <w:rFonts w:cs="Carlito"/>
+          <w:sz w:val="32"/>
+          <w:szCs w:val="32"/>
+        </w:rPr>
+        <w:t>, we’re creating a child class for a particular combination</w:t>
+      </w:r>
+      <w:r>
+        <w:rPr>
+          <w:rFonts w:cs="Carlito"/>
+          <w:sz w:val="32"/>
+          <w:szCs w:val="32"/>
+        </w:rPr>
+        <w:t>:</w:t>
+      </w:r>
+    </w:p>
+    <w:p>
+      <w:pPr>
+        <w:jc w:val="both"/>
+        <w:rPr>
+          <w:rFonts w:cs="Carlito"/>
+          <w:b/>
+          <w:bCs/>
+          <w:color w:val="D86DCB" w:themeColor="accent5" w:themeTint="99"/>
+          <w:sz w:val="32"/>
+          <w:szCs w:val="32"/>
+        </w:rPr>
+      </w:pPr>
+      <w:r>
+        <w:rPr>
+          <w:rFonts w:cs="Carlito"/>
+          <w:b/>
+          <w:bCs/>
+          <w:color w:val="D86DCB" w:themeColor="accent5" w:themeTint="99"/>
+          <w:sz w:val="32"/>
+          <w:szCs w:val="32"/>
+        </w:rPr>
+        <w:t xml:space="preserve">class </w:t>
+      </w:r>
+      <w:proofErr w:type="spellStart"/>
+      <w:proofErr w:type="gramStart"/>
+      <w:r>
+        <w:rPr>
+          <w:rFonts w:cs="Carlito"/>
+          <w:b/>
+          <w:bCs/>
+          <w:color w:val="D86DCB" w:themeColor="accent5" w:themeTint="99"/>
+          <w:sz w:val="32"/>
+          <w:szCs w:val="32"/>
+        </w:rPr>
+        <w:t>LoggedPayment</w:t>
+      </w:r>
+      <w:proofErr w:type="spellEnd"/>
+      <w:r>
+        <w:rPr>
+          <w:rFonts w:cs="Carlito"/>
+          <w:b/>
+          <w:bCs/>
+          <w:color w:val="D86DCB" w:themeColor="accent5" w:themeTint="99"/>
+          <w:sz w:val="32"/>
+          <w:szCs w:val="32"/>
+        </w:rPr>
+        <w:t>(</w:t>
+      </w:r>
+      <w:proofErr w:type="gramEnd"/>
+      <w:r>
+        <w:rPr>
+          <w:rFonts w:cs="Carlito"/>
+          <w:b/>
+          <w:bCs/>
+          <w:color w:val="D86DCB" w:themeColor="accent5" w:themeTint="99"/>
+          <w:sz w:val="32"/>
+          <w:szCs w:val="32"/>
+        </w:rPr>
+        <w:t>Payment):</w:t>
+      </w:r>
+    </w:p>
+    <w:p>
+      <w:pPr>
+        <w:jc w:val="both"/>
+        <w:rPr>
+          <w:rFonts w:cs="Carlito"/>
+          <w:b/>
+          <w:bCs/>
+          <w:color w:val="D86DCB" w:themeColor="accent5" w:themeTint="99"/>
+          <w:sz w:val="32"/>
+          <w:szCs w:val="32"/>
+        </w:rPr>
+      </w:pPr>
+      <w:r>
+        <w:rPr>
+          <w:rFonts w:cs="Carlito"/>
+          <w:b/>
+          <w:bCs/>
+          <w:color w:val="D86DCB" w:themeColor="accent5" w:themeTint="99"/>
+          <w:sz w:val="32"/>
+          <w:szCs w:val="32"/>
+        </w:rPr>
+        <w:t xml:space="preserve">    ...</w:t>
+      </w:r>
+    </w:p>
+    <w:p>
+      <w:pPr>
+        <w:jc w:val="both"/>
+        <w:rPr>
+          <w:rFonts w:cs="Carlito"/>
+          <w:sz w:val="32"/>
+          <w:szCs w:val="32"/>
+        </w:rPr>
+      </w:pPr>
+      <w:r>
+        <w:rPr>
+          <w:rFonts w:cs="Carlito"/>
+          <w:sz w:val="32"/>
+          <w:szCs w:val="32"/>
+        </w:rPr>
+        <w:t># But w</w:t>
+      </w:r>
+      <w:r>
+        <w:rPr>
+          <w:rFonts w:cs="Carlito"/>
+          <w:sz w:val="32"/>
+          <w:szCs w:val="32"/>
+        </w:rPr>
+        <w:t>ith decorators</w:t>
+      </w:r>
+      <w:r>
+        <w:rPr>
+          <w:rFonts w:cs="Carlito"/>
+          <w:sz w:val="32"/>
+          <w:szCs w:val="32"/>
+        </w:rPr>
+        <w:t xml:space="preserve"> we can combine behaviors at runtime and in different combinations</w:t>
+      </w:r>
+      <w:r>
+        <w:rPr>
+          <w:rFonts w:cs="Carlito"/>
+          <w:sz w:val="32"/>
+          <w:szCs w:val="32"/>
+        </w:rPr>
+        <w:t>:</w:t>
+      </w:r>
+    </w:p>
+    <w:p>
+      <w:pPr>
+        <w:jc w:val="both"/>
+        <w:rPr>
+          <w:rFonts w:cs="Carlito"/>
+          <w:b/>
+          <w:bCs/>
+          <w:color w:val="D86DCB" w:themeColor="accent5" w:themeTint="99"/>
+          <w:sz w:val="32"/>
+          <w:szCs w:val="32"/>
+        </w:rPr>
+      </w:pPr>
+      <w:r>
+        <w:rPr>
+          <w:rFonts w:cs="Carlito"/>
+          <w:b/>
+          <w:bCs/>
+          <w:color w:val="D86DCB" w:themeColor="accent5" w:themeTint="99"/>
+          <w:sz w:val="32"/>
+          <w:szCs w:val="32"/>
+        </w:rPr>
+        <w:t xml:space="preserve">payment = </w:t>
+      </w:r>
+      <w:proofErr w:type="spellStart"/>
+      <w:r>
+        <w:rPr>
+          <w:rFonts w:cs="Carlito"/>
+          <w:b/>
+          <w:bCs/>
+          <w:color w:val="D86DCB" w:themeColor="accent5" w:themeTint="99"/>
+          <w:sz w:val="32"/>
+          <w:szCs w:val="32"/>
+        </w:rPr>
+        <w:t>LoggingDecorator</w:t>
+      </w:r>
+      <w:proofErr w:type="spellEnd"/>
+      <w:r>
+        <w:rPr>
+          <w:rFonts w:cs="Carlito"/>
+          <w:b/>
+          <w:bCs/>
+          <w:color w:val="D86DCB" w:themeColor="accent5" w:themeTint="99"/>
+          <w:sz w:val="32"/>
+          <w:szCs w:val="32"/>
+        </w:rPr>
+        <w:t>(payment)</w:t>
+      </w:r>
+    </w:p>
+    <w:p>
+      <w:pPr>
+        <w:jc w:val="both"/>
+        <w:rPr>
+          <w:rFonts w:cs="Carlito"/>
+          <w:b/>
+          <w:bCs/>
+          <w:color w:val="D86DCB" w:themeColor="accent5" w:themeTint="99"/>
+          <w:sz w:val="32"/>
+          <w:szCs w:val="32"/>
+        </w:rPr>
+      </w:pPr>
+      <w:r>
+        <w:rPr>
+          <w:rFonts w:cs="Carlito"/>
+          <w:b/>
+          <w:bCs/>
+          <w:color w:val="D86DCB" w:themeColor="accent5" w:themeTint="99"/>
+          <w:sz w:val="32"/>
+          <w:szCs w:val="32"/>
+        </w:rPr>
+        <w:t xml:space="preserve">payment = </w:t>
+      </w:r>
+      <w:proofErr w:type="spellStart"/>
+      <w:r>
+        <w:rPr>
+          <w:rFonts w:cs="Carlito"/>
+          <w:b/>
+          <w:bCs/>
+          <w:color w:val="D86DCB" w:themeColor="accent5" w:themeTint="99"/>
+          <w:sz w:val="32"/>
+          <w:szCs w:val="32"/>
+        </w:rPr>
+        <w:t>RetryDecorator</w:t>
+      </w:r>
+      <w:proofErr w:type="spellEnd"/>
+      <w:r>
+        <w:rPr>
+          <w:rFonts w:cs="Carlito"/>
+          <w:b/>
+          <w:bCs/>
+          <w:color w:val="D86DCB" w:themeColor="accent5" w:themeTint="99"/>
+          <w:sz w:val="32"/>
+          <w:szCs w:val="32"/>
+        </w:rPr>
+        <w:t>(payment)</w:t>
+      </w:r>
+    </w:p>
+    <w:p>
+      <w:pPr>
+        <w:jc w:val="both"/>
+        <w:rPr>
+          <w:rFonts w:cs="Carlito"/>
+          <w:sz w:val="32"/>
+          <w:szCs w:val="32"/>
+        </w:rPr>
+      </w:pPr>
+    </w:p>
+    <w:p>
+      <w:pPr>
+        <w:jc w:val="both"/>
+        <w:rPr>
+          <w:rFonts w:cs="Carlito"/>
+          <w:sz w:val="32"/>
+          <w:szCs w:val="32"/>
+        </w:rPr>
+      </w:pPr>
+    </w:p>
+    <w:p>
+      <w:pPr>
+        <w:jc w:val="both"/>
+        <w:rPr>
+          <w:rFonts w:cs="Carlito"/>
+          <w:sz w:val="32"/>
+          <w:szCs w:val="32"/>
+        </w:rPr>
+      </w:pPr>
+      <w:r>
+        <w:rPr>
+          <w:rFonts w:cs="Carlito"/>
+          <w:sz w:val="32"/>
+          <w:szCs w:val="32"/>
+        </w:rPr>
+        <w:t>Pythons</w:t>
+      </w:r>
+      <w:r>
+        <w:rPr>
+          <w:rFonts w:cs="Carlito"/>
+          <w:sz w:val="32"/>
+          <w:szCs w:val="32"/>
+        </w:rPr>
+        <w:t xml:space="preserve"> @decorator</w:t>
+      </w:r>
+      <w:r>
+        <w:rPr>
+          <w:rFonts w:cs="Carlito"/>
+          <w:sz w:val="32"/>
+          <w:szCs w:val="32"/>
+        </w:rPr>
+        <w:t>:</w:t>
+      </w:r>
+    </w:p>
+    <w:p>
+      <w:pPr>
+        <w:jc w:val="both"/>
+        <w:rPr>
+          <w:rFonts w:cs="Carlito"/>
+          <w:sz w:val="32"/>
+          <w:szCs w:val="32"/>
+        </w:rPr>
+      </w:pPr>
+      <w:r>
+        <w:rPr>
+          <w:rFonts w:cs="Carlito"/>
+          <w:sz w:val="32"/>
+          <w:szCs w:val="32"/>
+        </w:rPr>
+        <w:t xml:space="preserve"># </w:t>
+      </w:r>
+      <w:r>
+        <w:rPr>
+          <w:rFonts w:cs="Carlito"/>
+          <w:sz w:val="32"/>
+          <w:szCs w:val="32"/>
+        </w:rPr>
+        <w:t>Python provides decorator syntax:</w:t>
+      </w:r>
+    </w:p>
+    <w:p>
+      <w:pPr>
+        <w:jc w:val="both"/>
+        <w:rPr>
+          <w:rFonts w:cs="Carlito"/>
+          <w:b/>
+          <w:bCs/>
+          <w:color w:val="D86DCB" w:themeColor="accent5" w:themeTint="99"/>
+          <w:sz w:val="32"/>
+          <w:szCs w:val="32"/>
+        </w:rPr>
+      </w:pPr>
+      <w:r>
+        <w:rPr>
+          <w:rFonts w:cs="Carlito"/>
+          <w:b/>
+          <w:bCs/>
+          <w:color w:val="D86DCB" w:themeColor="accent5" w:themeTint="99"/>
+          <w:sz w:val="32"/>
+          <w:szCs w:val="32"/>
+        </w:rPr>
+        <w:t>@logger</w:t>
+      </w:r>
+    </w:p>
+    <w:p>
+      <w:pPr>
+        <w:jc w:val="both"/>
+        <w:rPr>
+          <w:rFonts w:cs="Carlito"/>
+          <w:b/>
+          <w:bCs/>
+          <w:color w:val="D86DCB" w:themeColor="accent5" w:themeTint="99"/>
+          <w:sz w:val="32"/>
+          <w:szCs w:val="32"/>
+        </w:rPr>
+      </w:pPr>
+      <w:r>
+        <w:rPr>
+          <w:rFonts w:cs="Carlito"/>
+          <w:b/>
+          <w:bCs/>
+          <w:color w:val="D86DCB" w:themeColor="accent5" w:themeTint="99"/>
+          <w:sz w:val="32"/>
+          <w:szCs w:val="32"/>
+        </w:rPr>
+        <w:t xml:space="preserve">def </w:t>
+      </w:r>
+      <w:proofErr w:type="spellStart"/>
+      <w:r>
+        <w:rPr>
+          <w:rFonts w:cs="Carlito"/>
+          <w:b/>
+          <w:bCs/>
+          <w:color w:val="D86DCB" w:themeColor="accent5" w:themeTint="99"/>
+          <w:sz w:val="32"/>
+          <w:szCs w:val="32"/>
+        </w:rPr>
+        <w:t>create_</w:t>
+      </w:r>
+      <w:proofErr w:type="gramStart"/>
+      <w:r>
+        <w:rPr>
+          <w:rFonts w:cs="Carlito"/>
+          <w:b/>
+          <w:bCs/>
+          <w:color w:val="D86DCB" w:themeColor="accent5" w:themeTint="99"/>
+          <w:sz w:val="32"/>
+          <w:szCs w:val="32"/>
+        </w:rPr>
+        <w:t>user</w:t>
+      </w:r>
+      <w:proofErr w:type="spellEnd"/>
+      <w:r>
+        <w:rPr>
+          <w:rFonts w:cs="Carlito"/>
+          <w:b/>
+          <w:bCs/>
+          <w:color w:val="D86DCB" w:themeColor="accent5" w:themeTint="99"/>
+          <w:sz w:val="32"/>
+          <w:szCs w:val="32"/>
+        </w:rPr>
+        <w:t>(</w:t>
+      </w:r>
+      <w:proofErr w:type="gramEnd"/>
+      <w:r>
+        <w:rPr>
+          <w:rFonts w:cs="Carlito"/>
+          <w:b/>
+          <w:bCs/>
+          <w:color w:val="D86DCB" w:themeColor="accent5" w:themeTint="99"/>
+          <w:sz w:val="32"/>
+          <w:szCs w:val="32"/>
+        </w:rPr>
+        <w:t>):</w:t>
+      </w:r>
+    </w:p>
+    <w:p>
+      <w:pPr>
+        <w:jc w:val="both"/>
+        <w:rPr>
+          <w:rFonts w:cs="Carlito"/>
+          <w:b/>
+          <w:bCs/>
+          <w:color w:val="D86DCB" w:themeColor="accent5" w:themeTint="99"/>
+          <w:sz w:val="32"/>
+          <w:szCs w:val="32"/>
+        </w:rPr>
+      </w:pPr>
+      <w:r>
+        <w:rPr>
+          <w:rFonts w:cs="Carlito"/>
+          <w:b/>
+          <w:bCs/>
+          <w:color w:val="D86DCB" w:themeColor="accent5" w:themeTint="99"/>
+          <w:sz w:val="32"/>
+          <w:szCs w:val="32"/>
+        </w:rPr>
+        <w:t xml:space="preserve">    ...</w:t>
+      </w:r>
+    </w:p>
+    <w:p>
+      <w:pPr>
+        <w:jc w:val="both"/>
+        <w:rPr>
+          <w:rFonts w:cs="Carlito"/>
+          <w:sz w:val="32"/>
+          <w:szCs w:val="32"/>
+        </w:rPr>
+      </w:pPr>
+      <w:r>
+        <w:rPr>
+          <w:rFonts w:cs="Carlito"/>
+          <w:sz w:val="32"/>
+          <w:szCs w:val="32"/>
+        </w:rPr>
+        <w:t># W</w:t>
+      </w:r>
+      <w:r>
+        <w:rPr>
+          <w:rFonts w:cs="Carlito"/>
+          <w:sz w:val="32"/>
+          <w:szCs w:val="32"/>
+        </w:rPr>
+        <w:t xml:space="preserve">hich </w:t>
+      </w:r>
+      <w:r>
+        <w:rPr>
+          <w:rFonts w:cs="Carlito"/>
+          <w:sz w:val="32"/>
+          <w:szCs w:val="32"/>
+        </w:rPr>
+        <w:t>internally does this</w:t>
+      </w:r>
+      <w:r>
+        <w:rPr>
+          <w:rFonts w:cs="Carlito"/>
+          <w:sz w:val="32"/>
+          <w:szCs w:val="32"/>
+        </w:rPr>
+        <w:t>:</w:t>
+      </w:r>
+    </w:p>
+    <w:p>
+      <w:pPr>
+        <w:jc w:val="both"/>
+        <w:rPr>
+          <w:rFonts w:cs="Carlito"/>
+          <w:b/>
+          <w:bCs/>
+          <w:color w:val="D86DCB" w:themeColor="accent5" w:themeTint="99"/>
+          <w:sz w:val="32"/>
+          <w:szCs w:val="32"/>
+        </w:rPr>
+      </w:pPr>
+      <w:r>
+        <w:rPr>
+          <w:rFonts w:cs="Carlito"/>
+          <w:b/>
+          <w:bCs/>
+          <w:color w:val="D86DCB" w:themeColor="accent5" w:themeTint="99"/>
+          <w:sz w:val="32"/>
+          <w:szCs w:val="32"/>
+        </w:rPr>
+        <w:t xml:space="preserve">def </w:t>
+      </w:r>
+      <w:proofErr w:type="spellStart"/>
+      <w:r>
+        <w:rPr>
+          <w:rFonts w:cs="Carlito"/>
+          <w:b/>
+          <w:bCs/>
+          <w:color w:val="D86DCB" w:themeColor="accent5" w:themeTint="99"/>
+          <w:sz w:val="32"/>
+          <w:szCs w:val="32"/>
+        </w:rPr>
+        <w:t>create_</w:t>
+      </w:r>
+      <w:proofErr w:type="gramStart"/>
+      <w:r>
+        <w:rPr>
+          <w:rFonts w:cs="Carlito"/>
+          <w:b/>
+          <w:bCs/>
+          <w:color w:val="D86DCB" w:themeColor="accent5" w:themeTint="99"/>
+          <w:sz w:val="32"/>
+          <w:szCs w:val="32"/>
+        </w:rPr>
+        <w:t>user</w:t>
+      </w:r>
+      <w:proofErr w:type="spellEnd"/>
+      <w:r>
+        <w:rPr>
+          <w:rFonts w:cs="Carlito"/>
+          <w:b/>
+          <w:bCs/>
+          <w:color w:val="D86DCB" w:themeColor="accent5" w:themeTint="99"/>
+          <w:sz w:val="32"/>
+          <w:szCs w:val="32"/>
+        </w:rPr>
+        <w:t>(</w:t>
+      </w:r>
+      <w:proofErr w:type="gramEnd"/>
+      <w:r>
+        <w:rPr>
+          <w:rFonts w:cs="Carlito"/>
+          <w:b/>
+          <w:bCs/>
+          <w:color w:val="D86DCB" w:themeColor="accent5" w:themeTint="99"/>
+          <w:sz w:val="32"/>
+          <w:szCs w:val="32"/>
+        </w:rPr>
+        <w:t>):</w:t>
+      </w:r>
+    </w:p>
+    <w:p>
+      <w:pPr>
+        <w:jc w:val="both"/>
+        <w:rPr>
+          <w:rFonts w:cs="Carlito"/>
+          <w:b/>
+          <w:bCs/>
+          <w:color w:val="D86DCB" w:themeColor="accent5" w:themeTint="99"/>
+          <w:sz w:val="32"/>
+          <w:szCs w:val="32"/>
+        </w:rPr>
+      </w:pPr>
+      <w:r>
+        <w:rPr>
+          <w:rFonts w:cs="Carlito"/>
+          <w:b/>
+          <w:bCs/>
+          <w:color w:val="D86DCB" w:themeColor="accent5" w:themeTint="99"/>
+          <w:sz w:val="32"/>
+          <w:szCs w:val="32"/>
+        </w:rPr>
+        <w:t xml:space="preserve">    ...</w:t>
+      </w:r>
+    </w:p>
+    <w:p>
+      <w:pPr>
+        <w:jc w:val="both"/>
+        <w:rPr>
+          <w:rFonts w:cs="Carlito"/>
+          <w:b/>
+          <w:bCs/>
+          <w:color w:val="D86DCB" w:themeColor="accent5" w:themeTint="99"/>
+          <w:sz w:val="32"/>
+          <w:szCs w:val="32"/>
+        </w:rPr>
+      </w:pPr>
+      <w:proofErr w:type="spellStart"/>
+      <w:r>
+        <w:rPr>
+          <w:rFonts w:cs="Carlito"/>
+          <w:b/>
+          <w:bCs/>
+          <w:color w:val="D86DCB" w:themeColor="accent5" w:themeTint="99"/>
+          <w:sz w:val="32"/>
+          <w:szCs w:val="32"/>
+        </w:rPr>
+        <w:t>create_user</w:t>
+      </w:r>
+      <w:proofErr w:type="spellEnd"/>
+      <w:r>
+        <w:rPr>
+          <w:rFonts w:cs="Carlito"/>
+          <w:b/>
+          <w:bCs/>
+          <w:color w:val="D86DCB" w:themeColor="accent5" w:themeTint="99"/>
+          <w:sz w:val="32"/>
+          <w:szCs w:val="32"/>
+        </w:rPr>
+        <w:t xml:space="preserve"> = logger(</w:t>
+      </w:r>
+      <w:proofErr w:type="spellStart"/>
+      <w:r>
+        <w:rPr>
+          <w:rFonts w:cs="Carlito"/>
+          <w:b/>
+          <w:bCs/>
+          <w:color w:val="D86DCB" w:themeColor="accent5" w:themeTint="99"/>
+          <w:sz w:val="32"/>
+          <w:szCs w:val="32"/>
+        </w:rPr>
+        <w:t>create_user</w:t>
+      </w:r>
+      <w:proofErr w:type="spellEnd"/>
+      <w:r>
+        <w:rPr>
+          <w:rFonts w:cs="Carlito"/>
+          <w:b/>
+          <w:bCs/>
+          <w:color w:val="D86DCB" w:themeColor="accent5" w:themeTint="99"/>
+          <w:sz w:val="32"/>
+          <w:szCs w:val="32"/>
+        </w:rPr>
+        <w:t>)</w:t>
+      </w:r>
+    </w:p>
+    <w:p>
+      <w:pPr>
+        <w:jc w:val="both"/>
+        <w:rPr>
+          <w:rFonts w:cs="Carlito"/>
+          <w:sz w:val="32"/>
+          <w:szCs w:val="32"/>
+        </w:rPr>
+      </w:pPr>
+      <w:r>
+        <w:rPr>
+          <w:rFonts w:cs="Carlito"/>
+          <w:sz w:val="32"/>
+          <w:szCs w:val="32"/>
+        </w:rPr>
+        <w:t xml:space="preserve"># </w:t>
+      </w:r>
+      <w:r>
+        <w:rPr>
+          <w:rFonts w:cs="Carlito"/>
+          <w:sz w:val="32"/>
+          <w:szCs w:val="32"/>
+        </w:rPr>
+        <w:t>So</w:t>
+      </w:r>
+      <w:r>
+        <w:rPr>
+          <w:rFonts w:cs="Carlito"/>
+          <w:sz w:val="32"/>
+          <w:szCs w:val="32"/>
+        </w:rPr>
+        <w:t>,</w:t>
+      </w:r>
+      <w:r>
+        <w:rPr>
+          <w:rFonts w:cs="Carlito"/>
+          <w:sz w:val="32"/>
+          <w:szCs w:val="32"/>
+        </w:rPr>
+        <w:t xml:space="preserve"> Python's function decorators are strongly related to the Decorator Pattern, but don't confuse the syntax with the broader design pattern</w:t>
+      </w:r>
+    </w:p>
+    <w:p>
+      <w:pPr>
+        <w:jc w:val="both"/>
+        <w:rPr>
+          <w:rFonts w:cs="Carlito"/>
+          <w:sz w:val="32"/>
+          <w:szCs w:val="32"/>
+        </w:rPr>
+      </w:pPr>
+      <w:r>
+        <w:rPr>
+          <w:rFonts w:cs="Carlito"/>
+          <w:sz w:val="32"/>
+          <w:szCs w:val="32"/>
+        </w:rPr>
+        <w:t xml:space="preserve"># </w:t>
+      </w:r>
+      <w:r>
+        <w:rPr>
+          <w:rFonts w:cs="Carlito"/>
+          <w:sz w:val="32"/>
+          <w:szCs w:val="32"/>
+        </w:rPr>
+        <w:t>Remember this</w:t>
+      </w:r>
+      <w:r>
+        <w:rPr>
+          <w:rFonts w:cs="Carlito"/>
+          <w:sz w:val="32"/>
+          <w:szCs w:val="32"/>
+        </w:rPr>
+        <w:t xml:space="preserve">, </w:t>
+      </w:r>
+      <w:r>
+        <w:rPr>
+          <w:rFonts w:cs="Carlito"/>
+          <w:sz w:val="32"/>
+          <w:szCs w:val="32"/>
+        </w:rPr>
+        <w:t>Strategy = replace the algorithm</w:t>
+      </w:r>
+      <w:r>
+        <w:rPr>
+          <w:rFonts w:cs="Carlito"/>
+          <w:sz w:val="32"/>
+          <w:szCs w:val="32"/>
+        </w:rPr>
+        <w:t xml:space="preserve">. </w:t>
+      </w:r>
+      <w:r>
+        <w:rPr>
+          <w:rFonts w:cs="Carlito"/>
+          <w:sz w:val="32"/>
+          <w:szCs w:val="32"/>
+        </w:rPr>
+        <w:t>Decorator = add behavior around the existing algorithm/object.</w:t>
+      </w:r>
+    </w:p>
+    <w:p>
+      <w:pPr>
+        <w:jc w:val="both"/>
+        <w:rPr>
+          <w:rFonts w:cs="Carlito"/>
+          <w:sz w:val="32"/>
+          <w:szCs w:val="32"/>
+        </w:rPr>
+      </w:pPr>
+    </w:p>
+    <w:p>
+      <w:pPr>
+        <w:jc w:val="center"/>
+        <w:rPr>
+          <w:rFonts w:cs="Carlito"/>
+          <w:sz w:val="32"/>
+          <w:szCs w:val="32"/>
+        </w:rPr>
+      </w:pPr>
+      <w:r>
+        <w:rPr>
+          <w:rFonts w:cs="Carlito"/>
+          <w:sz w:val="32"/>
+          <w:szCs w:val="32"/>
+        </w:rPr>
+        <w:t>Break</w:t>
+      </w:r>
+    </w:p>
+    <w:p>
+      <w:pPr>
+        <w:jc w:val="both"/>
+        <w:rPr>
+          <w:rFonts w:cs="Carlito"/>
+          <w:sz w:val="32"/>
+          <w:szCs w:val="32"/>
+        </w:rPr>
+      </w:pPr>
+    </w:p>
+    <w:p>
+      <w:pPr>
+        <w:jc w:val="both"/>
+        <w:rPr>
+          <w:rFonts w:cs="Carlito"/>
+          <w:b/>
+          <w:bCs/>
+          <w:sz w:val="32"/>
+          <w:szCs w:val="32"/>
+        </w:rPr>
+      </w:pPr>
+      <w:r>
+        <w:rPr>
+          <w:rFonts w:cs="Carlito"/>
+          <w:b/>
+          <w:bCs/>
+          <w:sz w:val="32"/>
+          <w:szCs w:val="32"/>
+        </w:rPr>
+        <w:t>D</w:t>
+      </w:r>
+      <w:r>
+        <w:rPr>
+          <w:rFonts w:cs="Carlito"/>
+          <w:b/>
+          <w:bCs/>
+          <w:sz w:val="32"/>
+          <w:szCs w:val="32"/>
+        </w:rPr>
+        <w:t>I</w:t>
+      </w:r>
+      <w:r>
+        <w:rPr>
+          <w:rFonts w:cs="Carlito"/>
+          <w:b/>
+          <w:bCs/>
+          <w:sz w:val="32"/>
+          <w:szCs w:val="32"/>
+        </w:rPr>
+        <w:t xml:space="preserve"> Pattern in Python:</w:t>
+      </w:r>
+    </w:p>
+    <w:p>
+      <w:pPr>
+        <w:jc w:val="both"/>
+        <w:rPr>
+          <w:rFonts w:cs="Carlito"/>
+          <w:sz w:val="32"/>
+          <w:szCs w:val="32"/>
+        </w:rPr>
+      </w:pPr>
+      <w:r>
+        <w:rPr>
+          <w:rFonts w:cs="Carlito"/>
+          <w:sz w:val="32"/>
+          <w:szCs w:val="32"/>
+        </w:rPr>
+        <w:t xml:space="preserve"># </w:t>
+      </w:r>
+      <w:r>
+        <w:rPr>
+          <w:rFonts w:cs="Carlito"/>
+          <w:sz w:val="32"/>
+          <w:szCs w:val="32"/>
+        </w:rPr>
+        <w:t>Dependency Injection is a technique where an object receives the dependencies it needs from the outside</w:t>
+      </w:r>
+      <w:r>
+        <w:rPr>
+          <w:rFonts w:cs="Carlito"/>
+          <w:sz w:val="32"/>
+          <w:szCs w:val="32"/>
+        </w:rPr>
+        <w:t xml:space="preserve"> (usually through constructor)</w:t>
+      </w:r>
+      <w:r>
+        <w:rPr>
+          <w:rFonts w:cs="Carlito"/>
+          <w:sz w:val="32"/>
+          <w:szCs w:val="32"/>
+        </w:rPr>
+        <w:t xml:space="preserve"> instead of creating those dependencies</w:t>
+      </w:r>
+      <w:r>
+        <w:rPr>
+          <w:rFonts w:cs="Carlito"/>
+          <w:sz w:val="32"/>
+          <w:szCs w:val="32"/>
+        </w:rPr>
+        <w:t xml:space="preserve"> in</w:t>
+      </w:r>
+      <w:r>
+        <w:rPr>
+          <w:rFonts w:cs="Carlito"/>
+          <w:sz w:val="32"/>
+          <w:szCs w:val="32"/>
+        </w:rPr>
+        <w:t xml:space="preserve"> itself</w:t>
+      </w:r>
+    </w:p>
+    <w:p>
+      <w:pPr>
+        <w:jc w:val="both"/>
+        <w:rPr>
+          <w:rFonts w:cs="Carlito"/>
+          <w:sz w:val="32"/>
+          <w:szCs w:val="32"/>
+        </w:rPr>
+      </w:pPr>
+      <w:r>
+        <w:rPr>
+          <w:rFonts w:cs="Carlito"/>
+          <w:sz w:val="32"/>
+          <w:szCs w:val="32"/>
+        </w:rPr>
+        <w:t xml:space="preserve"># </w:t>
+      </w:r>
+      <w:r>
+        <w:rPr>
+          <w:rFonts w:cs="Carlito"/>
+          <w:sz w:val="32"/>
+          <w:szCs w:val="32"/>
+        </w:rPr>
+        <w:t>The key idea is simply</w:t>
+      </w:r>
+      <w:r>
+        <w:rPr>
+          <w:rFonts w:cs="Carlito"/>
+          <w:sz w:val="32"/>
+          <w:szCs w:val="32"/>
+        </w:rPr>
+        <w:t xml:space="preserve"> “</w:t>
+      </w:r>
+      <w:r>
+        <w:rPr>
+          <w:rFonts w:cs="Carlito"/>
+          <w:sz w:val="32"/>
+          <w:szCs w:val="32"/>
+        </w:rPr>
+        <w:t>Don't create your dependencies inside the class. Give them to the class</w:t>
+      </w:r>
+      <w:r>
+        <w:rPr>
+          <w:rFonts w:cs="Carlito"/>
+          <w:sz w:val="32"/>
+          <w:szCs w:val="32"/>
+        </w:rPr>
+        <w:t>”</w:t>
+      </w:r>
+    </w:p>
+    <w:p>
+      <w:pPr>
+        <w:jc w:val="both"/>
+        <w:rPr>
+          <w:rFonts w:cs="Carlito"/>
+          <w:sz w:val="32"/>
+          <w:szCs w:val="32"/>
+        </w:rPr>
+      </w:pPr>
+    </w:p>
+    <w:p>
+      <w:pPr>
+        <w:jc w:val="both"/>
+        <w:rPr>
+          <w:rFonts w:cs="Carlito"/>
+          <w:sz w:val="32"/>
+          <w:szCs w:val="32"/>
+        </w:rPr>
+      </w:pPr>
     </w:p>
     <w:p>
       <w:pPr>
@@ -19397,6 +21941,119 @@
     </w:lvl>
   </w:abstractNum>
   <w:abstractNum w:abstractNumId="2" w15:restartNumberingAfterBreak="0">
+    <w:nsid w:val="0B974A5B"/>
+    <w:multiLevelType w:val="hybridMultilevel"/>
+    <w:tmpl w:val="A22632F0"/>
+    <w:lvl w:ilvl="0" w:tplc="04090001">
+      <w:start w:val="1"/>
+      <w:numFmt w:val="bullet"/>
+      <w:lvlText w:val=""/>
+      <w:lvlJc w:val="left"/>
+      <w:pPr>
+        <w:ind w:left="360" w:hanging="360"/>
+      </w:pPr>
+      <w:rPr>
+        <w:rFonts w:ascii="Symbol" w:hAnsi="Symbol" w:hint="default"/>
+      </w:rPr>
+    </w:lvl>
+    <w:lvl w:ilvl="1" w:tplc="04090003" w:tentative="1">
+      <w:start w:val="1"/>
+      <w:numFmt w:val="bullet"/>
+      <w:lvlText w:val="o"/>
+      <w:lvlJc w:val="left"/>
+      <w:pPr>
+        <w:ind w:left="1080" w:hanging="360"/>
+      </w:pPr>
+      <w:rPr>
+        <w:rFonts w:ascii="Courier New" w:hAnsi="Courier New" w:cs="Courier New" w:hint="default"/>
+      </w:rPr>
+    </w:lvl>
+    <w:lvl w:ilvl="2" w:tplc="04090005" w:tentative="1">
+      <w:start w:val="1"/>
+      <w:numFmt w:val="bullet"/>
+      <w:lvlText w:val=""/>
+      <w:lvlJc w:val="left"/>
+      <w:pPr>
+        <w:ind w:left="1800" w:hanging="360"/>
+      </w:pPr>
+      <w:rPr>
+        <w:rFonts w:ascii="Wingdings" w:hAnsi="Wingdings" w:hint="default"/>
+      </w:rPr>
+    </w:lvl>
+    <w:lvl w:ilvl="3" w:tplc="04090001" w:tentative="1">
+      <w:start w:val="1"/>
+      <w:numFmt w:val="bullet"/>
+      <w:lvlText w:val=""/>
+      <w:lvlJc w:val="left"/>
+      <w:pPr>
+        <w:ind w:left="2520" w:hanging="360"/>
+      </w:pPr>
+      <w:rPr>
+        <w:rFonts w:ascii="Symbol" w:hAnsi="Symbol" w:hint="default"/>
+      </w:rPr>
+    </w:lvl>
+    <w:lvl w:ilvl="4" w:tplc="04090003" w:tentative="1">
+      <w:start w:val="1"/>
+      <w:numFmt w:val="bullet"/>
+      <w:lvlText w:val="o"/>
+      <w:lvlJc w:val="left"/>
+      <w:pPr>
+        <w:ind w:left="3240" w:hanging="360"/>
+      </w:pPr>
+      <w:rPr>
+        <w:rFonts w:ascii="Courier New" w:hAnsi="Courier New" w:cs="Courier New" w:hint="default"/>
+      </w:rPr>
+    </w:lvl>
+    <w:lvl w:ilvl="5" w:tplc="04090005" w:tentative="1">
+      <w:start w:val="1"/>
+      <w:numFmt w:val="bullet"/>
+      <w:lvlText w:val=""/>
+      <w:lvlJc w:val="left"/>
+      <w:pPr>
+        <w:ind w:left="3960" w:hanging="360"/>
+      </w:pPr>
+      <w:rPr>
+        <w:rFonts w:ascii="Wingdings" w:hAnsi="Wingdings" w:hint="default"/>
+      </w:rPr>
+    </w:lvl>
+    <w:lvl w:ilvl="6" w:tplc="04090001" w:tentative="1">
+      <w:start w:val="1"/>
+      <w:numFmt w:val="bullet"/>
+      <w:lvlText w:val=""/>
+      <w:lvlJc w:val="left"/>
+      <w:pPr>
+        <w:ind w:left="4680" w:hanging="360"/>
+      </w:pPr>
+      <w:rPr>
+        <w:rFonts w:ascii="Symbol" w:hAnsi="Symbol" w:hint="default"/>
+      </w:rPr>
+    </w:lvl>
+    <w:lvl w:ilvl="7" w:tplc="04090003" w:tentative="1">
+      <w:start w:val="1"/>
+      <w:numFmt w:val="bullet"/>
+      <w:lvlText w:val="o"/>
+      <w:lvlJc w:val="left"/>
+      <w:pPr>
+        <w:ind w:left="5400" w:hanging="360"/>
+      </w:pPr>
+      <w:rPr>
+        <w:rFonts w:ascii="Courier New" w:hAnsi="Courier New" w:cs="Courier New" w:hint="default"/>
+      </w:rPr>
+    </w:lvl>
+    <w:lvl w:ilvl="8" w:tplc="04090005" w:tentative="1">
+      <w:start w:val="1"/>
+      <w:numFmt w:val="bullet"/>
+      <w:lvlText w:val=""/>
+      <w:lvlJc w:val="left"/>
+      <w:pPr>
+        <w:ind w:left="6120" w:hanging="360"/>
+      </w:pPr>
+      <w:rPr>
+        <w:rFonts w:ascii="Wingdings" w:hAnsi="Wingdings" w:hint="default"/>
+      </w:rPr>
+    </w:lvl>
+  </w:abstractNum>
+  <w:abstractNum w:abstractNumId="3" w15:restartNumberingAfterBreak="0">
     <w:nsid w:val="0F9030A9"/>
     <w:multiLevelType w:val="hybridMultilevel"/>
     <w:tmpl w:val="49F6E6BA"/>
@@ -19487,7 +22144,7 @@
       </w:pPr>
     </w:lvl>
   </w:abstractNum>
-  <w:abstractNum w:abstractNumId="3" w15:restartNumberingAfterBreak="0">
+  <w:abstractNum w:abstractNumId="4" w15:restartNumberingAfterBreak="0">
     <w:nsid w:val="11495BB1"/>
     <w:multiLevelType w:val="hybridMultilevel"/>
     <w:tmpl w:val="98186254"/>
@@ -19578,7 +22235,7 @@
       </w:pPr>
     </w:lvl>
   </w:abstractNum>
-  <w:abstractNum w:abstractNumId="4" w15:restartNumberingAfterBreak="0">
+  <w:abstractNum w:abstractNumId="5" w15:restartNumberingAfterBreak="0">
     <w:nsid w:val="12446512"/>
     <w:multiLevelType w:val="hybridMultilevel"/>
     <w:tmpl w:val="5DC02990"/>
@@ -19691,7 +22348,7 @@
       </w:rPr>
     </w:lvl>
   </w:abstractNum>
-  <w:abstractNum w:abstractNumId="5" w15:restartNumberingAfterBreak="0">
+  <w:abstractNum w:abstractNumId="6" w15:restartNumberingAfterBreak="0">
     <w:nsid w:val="13F5615E"/>
     <w:multiLevelType w:val="hybridMultilevel"/>
     <w:tmpl w:val="208AAE94"/>
@@ -19782,7 +22439,7 @@
       </w:pPr>
     </w:lvl>
   </w:abstractNum>
-  <w:abstractNum w:abstractNumId="6" w15:restartNumberingAfterBreak="0">
+  <w:abstractNum w:abstractNumId="7" w15:restartNumberingAfterBreak="0">
     <w:nsid w:val="14303CA6"/>
     <w:multiLevelType w:val="hybridMultilevel"/>
     <w:tmpl w:val="BE54225E"/>
@@ -19895,7 +22552,7 @@
       </w:rPr>
     </w:lvl>
   </w:abstractNum>
-  <w:abstractNum w:abstractNumId="7" w15:restartNumberingAfterBreak="0">
+  <w:abstractNum w:abstractNumId="8" w15:restartNumberingAfterBreak="0">
     <w:nsid w:val="17BC3076"/>
     <w:multiLevelType w:val="hybridMultilevel"/>
     <w:tmpl w:val="BBFEA608"/>
@@ -20008,7 +22665,7 @@
       </w:rPr>
     </w:lvl>
   </w:abstractNum>
-  <w:abstractNum w:abstractNumId="8" w15:restartNumberingAfterBreak="0">
+  <w:abstractNum w:abstractNumId="9" w15:restartNumberingAfterBreak="0">
     <w:nsid w:val="25061A51"/>
     <w:multiLevelType w:val="hybridMultilevel"/>
     <w:tmpl w:val="A222909A"/>
@@ -20121,7 +22778,7 @@
       </w:rPr>
     </w:lvl>
   </w:abstractNum>
-  <w:abstractNum w:abstractNumId="9" w15:restartNumberingAfterBreak="0">
+  <w:abstractNum w:abstractNumId="10" w15:restartNumberingAfterBreak="0">
     <w:nsid w:val="28D521EA"/>
     <w:multiLevelType w:val="hybridMultilevel"/>
     <w:tmpl w:val="94DA1350"/>
@@ -20210,7 +22867,7 @@
       </w:pPr>
     </w:lvl>
   </w:abstractNum>
-  <w:abstractNum w:abstractNumId="10" w15:restartNumberingAfterBreak="0">
+  <w:abstractNum w:abstractNumId="11" w15:restartNumberingAfterBreak="0">
     <w:nsid w:val="32E525FA"/>
     <w:multiLevelType w:val="hybridMultilevel"/>
     <w:tmpl w:val="66880F18"/>
@@ -20323,7 +22980,7 @@
       </w:rPr>
     </w:lvl>
   </w:abstractNum>
-  <w:abstractNum w:abstractNumId="11" w15:restartNumberingAfterBreak="0">
+  <w:abstractNum w:abstractNumId="12" w15:restartNumberingAfterBreak="0">
     <w:nsid w:val="499930F4"/>
     <w:multiLevelType w:val="hybridMultilevel"/>
     <w:tmpl w:val="92322762"/>
@@ -20436,7 +23093,7 @@
       </w:rPr>
     </w:lvl>
   </w:abstractNum>
-  <w:abstractNum w:abstractNumId="12" w15:restartNumberingAfterBreak="0">
+  <w:abstractNum w:abstractNumId="13" w15:restartNumberingAfterBreak="0">
     <w:nsid w:val="557235B0"/>
     <w:multiLevelType w:val="hybridMultilevel"/>
     <w:tmpl w:val="B30C4356"/>
@@ -20549,7 +23206,7 @@
       </w:rPr>
     </w:lvl>
   </w:abstractNum>
-  <w:abstractNum w:abstractNumId="13" w15:restartNumberingAfterBreak="0">
+  <w:abstractNum w:abstractNumId="14" w15:restartNumberingAfterBreak="0">
     <w:nsid w:val="61147BCF"/>
     <w:multiLevelType w:val="hybridMultilevel"/>
     <w:tmpl w:val="18B6636E"/>
@@ -20662,7 +23319,7 @@
       </w:rPr>
     </w:lvl>
   </w:abstractNum>
-  <w:abstractNum w:abstractNumId="14" w15:restartNumberingAfterBreak="0">
+  <w:abstractNum w:abstractNumId="15" w15:restartNumberingAfterBreak="0">
     <w:nsid w:val="7AC76A5A"/>
     <w:multiLevelType w:val="hybridMultilevel"/>
     <w:tmpl w:val="BA60A748"/>
@@ -20775,7 +23432,7 @@
       </w:rPr>
     </w:lvl>
   </w:abstractNum>
-  <w:abstractNum w:abstractNumId="15" w15:restartNumberingAfterBreak="0">
+  <w:abstractNum w:abstractNumId="16" w15:restartNumberingAfterBreak="0">
     <w:nsid w:val="7BA83393"/>
     <w:multiLevelType w:val="hybridMultilevel"/>
     <w:tmpl w:val="B574B9C0"/>
@@ -20889,52 +23546,55 @@
     </w:lvl>
   </w:abstractNum>
   <w:num w:numId="1" w16cid:durableId="519512584">
+    <w:abstractNumId w:val="10"/>
+  </w:num>
+  <w:num w:numId="2" w16cid:durableId="396366051">
+    <w:abstractNumId w:val="15"/>
+  </w:num>
+  <w:num w:numId="3" w16cid:durableId="36322228">
+    <w:abstractNumId w:val="3"/>
+  </w:num>
+  <w:num w:numId="4" w16cid:durableId="1987315324">
+    <w:abstractNumId w:val="16"/>
+  </w:num>
+  <w:num w:numId="5" w16cid:durableId="1233350523">
+    <w:abstractNumId w:val="5"/>
+  </w:num>
+  <w:num w:numId="6" w16cid:durableId="1881747996">
+    <w:abstractNumId w:val="7"/>
+  </w:num>
+  <w:num w:numId="7" w16cid:durableId="333846032">
+    <w:abstractNumId w:val="8"/>
+  </w:num>
+  <w:num w:numId="8" w16cid:durableId="1506750727">
+    <w:abstractNumId w:val="4"/>
+  </w:num>
+  <w:num w:numId="9" w16cid:durableId="790705829">
+    <w:abstractNumId w:val="6"/>
+  </w:num>
+  <w:num w:numId="10" w16cid:durableId="921451841">
     <w:abstractNumId w:val="9"/>
   </w:num>
-  <w:num w:numId="2" w16cid:durableId="396366051">
-    <w:abstractNumId w:val="14"/>
-  </w:num>
-  <w:num w:numId="3" w16cid:durableId="36322228">
-    <w:abstractNumId w:val="2"/>
-  </w:num>
-  <w:num w:numId="4" w16cid:durableId="1987315324">
-    <w:abstractNumId w:val="15"/>
-  </w:num>
-  <w:num w:numId="5" w16cid:durableId="1233350523">
-    <w:abstractNumId w:val="4"/>
-  </w:num>
-  <w:num w:numId="6" w16cid:durableId="1881747996">
-    <w:abstractNumId w:val="6"/>
-  </w:num>
-  <w:num w:numId="7" w16cid:durableId="333846032">
-    <w:abstractNumId w:val="7"/>
-  </w:num>
-  <w:num w:numId="8" w16cid:durableId="1506750727">
-    <w:abstractNumId w:val="3"/>
-  </w:num>
-  <w:num w:numId="9" w16cid:durableId="790705829">
-    <w:abstractNumId w:val="5"/>
-  </w:num>
-  <w:num w:numId="10" w16cid:durableId="921451841">
-    <w:abstractNumId w:val="8"/>
-  </w:num>
   <w:num w:numId="11" w16cid:durableId="1848012878">
-    <w:abstractNumId w:val="10"/>
+    <w:abstractNumId w:val="11"/>
   </w:num>
   <w:num w:numId="12" w16cid:durableId="1623536556">
     <w:abstractNumId w:val="1"/>
   </w:num>
   <w:num w:numId="13" w16cid:durableId="688485596">
-    <w:abstractNumId w:val="13"/>
+    <w:abstractNumId w:val="14"/>
   </w:num>
   <w:num w:numId="14" w16cid:durableId="1301617483">
-    <w:abstractNumId w:val="11"/>
+    <w:abstractNumId w:val="12"/>
   </w:num>
   <w:num w:numId="15" w16cid:durableId="356784259">
     <w:abstractNumId w:val="0"/>
   </w:num>
   <w:num w:numId="16" w16cid:durableId="1758944444">
-    <w:abstractNumId w:val="12"/>
+    <w:abstractNumId w:val="13"/>
+  </w:num>
+  <w:num w:numId="17" w16cid:durableId="1258370908">
+    <w:abstractNumId w:val="2"/>
   </w:num>
 </w:numbering>
 </file>
@@ -21542,7 +24202,6 @@
   <w:style w:type="character" w:default="1" w:styleId="DefaultParagraphFont">
     <w:name w:val="Default Paragraph Font"/>
     <w:uiPriority w:val="1"/>
-    <w:semiHidden/>
     <w:unhideWhenUsed/>
   </w:style>
   <w:style w:type="table" w:default="1" w:styleId="TableNormal">

</xml_diff>

<commit_message>
docs: added DI pattern in Python
</commit_message>
<xml_diff>
--- a/python/p5_part_2_of_oop_of_python.docx
+++ b/python/p5_part_2_of_oop_of_python.docx
@@ -17623,7 +17623,29 @@
           <w:sz w:val="32"/>
           <w:szCs w:val="32"/>
         </w:rPr>
-        <w:t xml:space="preserve"> £{amount} using bKash")</w:t>
+        <w:t xml:space="preserve"> </w:t>
+      </w:r>
+      <w:r>
+        <w:rPr>
+          <w:rFonts w:cs="Carlito"/>
+          <w:b/>
+          <w:bCs/>
+          <w:color w:val="D86DCB" w:themeColor="accent5" w:themeTint="99"/>
+          <w:sz w:val="32"/>
+          <w:szCs w:val="32"/>
+        </w:rPr>
+        <w:t>$</w:t>
+      </w:r>
+      <w:r>
+        <w:rPr>
+          <w:rFonts w:cs="Carlito"/>
+          <w:b/>
+          <w:bCs/>
+          <w:color w:val="D86DCB" w:themeColor="accent5" w:themeTint="99"/>
+          <w:sz w:val="32"/>
+          <w:szCs w:val="32"/>
+        </w:rPr>
+        <w:t>{amount} using bKash")</w:t>
       </w:r>
     </w:p>
     <w:p>
@@ -17819,7 +17841,29 @@
           <w:sz w:val="32"/>
           <w:szCs w:val="32"/>
         </w:rPr>
-        <w:t xml:space="preserve"> £{amount} using Stripe")</w:t>
+        <w:t xml:space="preserve"> </w:t>
+      </w:r>
+      <w:r>
+        <w:rPr>
+          <w:rFonts w:cs="Carlito"/>
+          <w:b/>
+          <w:bCs/>
+          <w:color w:val="D86DCB" w:themeColor="accent5" w:themeTint="99"/>
+          <w:sz w:val="32"/>
+          <w:szCs w:val="32"/>
+        </w:rPr>
+        <w:t>$</w:t>
+      </w:r>
+      <w:r>
+        <w:rPr>
+          <w:rFonts w:cs="Carlito"/>
+          <w:b/>
+          <w:bCs/>
+          <w:color w:val="D86DCB" w:themeColor="accent5" w:themeTint="99"/>
+          <w:sz w:val="32"/>
+          <w:szCs w:val="32"/>
+        </w:rPr>
+        <w:t>{amount} using Stripe")</w:t>
       </w:r>
     </w:p>
     <w:p>
@@ -18446,12 +18490,9 @@
           <w:sz w:val="28"/>
           <w:szCs w:val="28"/>
         </w:rPr>
-        <w:t>Paid £500 using bKash</w:t>
-      </w:r>
-    </w:p>
-    <w:p>
-      <w:pPr>
-        <w:jc w:val="both"/>
+        <w:t xml:space="preserve">Paid </w:t>
+      </w:r>
+      <w:r>
         <w:rPr>
           <w:rFonts w:cs="Carlito"/>
           <w:b/>
@@ -18459,7 +18500,8 @@
           <w:sz w:val="28"/>
           <w:szCs w:val="28"/>
         </w:rPr>
-      </w:pPr>
+        <w:t>$</w:t>
+      </w:r>
       <w:r>
         <w:rPr>
           <w:rFonts w:cs="Carlito"/>
@@ -18468,7 +18510,49 @@
           <w:sz w:val="28"/>
           <w:szCs w:val="28"/>
         </w:rPr>
-        <w:t>Paid £500 using Stripe</w:t>
+        <w:t>500 using bKash</w:t>
+      </w:r>
+    </w:p>
+    <w:p>
+      <w:pPr>
+        <w:jc w:val="both"/>
+        <w:rPr>
+          <w:rFonts w:cs="Carlito"/>
+          <w:b/>
+          <w:bCs/>
+          <w:sz w:val="28"/>
+          <w:szCs w:val="28"/>
+        </w:rPr>
+      </w:pPr>
+      <w:r>
+        <w:rPr>
+          <w:rFonts w:cs="Carlito"/>
+          <w:b/>
+          <w:bCs/>
+          <w:sz w:val="28"/>
+          <w:szCs w:val="28"/>
+        </w:rPr>
+        <w:t xml:space="preserve">Paid </w:t>
+      </w:r>
+      <w:r>
+        <w:rPr>
+          <w:rFonts w:cs="Carlito"/>
+          <w:b/>
+          <w:bCs/>
+          <w:sz w:val="28"/>
+          <w:szCs w:val="28"/>
+        </w:rPr>
+        <w:t>$</w:t>
+      </w:r>
+      <w:r>
+        <w:rPr>
+          <w:rFonts w:cs="Carlito"/>
+          <w:b/>
+          <w:bCs/>
+          <w:sz w:val="28"/>
+          <w:szCs w:val="28"/>
+        </w:rPr>
+        <w:t>500 using Stripe</w:t>
       </w:r>
     </w:p>
     <w:p>
@@ -19846,29 +19930,7 @@
           <w:sz w:val="32"/>
           <w:szCs w:val="32"/>
         </w:rPr>
-        <w:t>())</w:t>
-      </w:r>
-      <w:r>
-        <w:rPr>
-          <w:rFonts w:cs="Carlito"/>
-          <w:b/>
-          <w:bCs/>
-          <w:color w:val="D86DCB" w:themeColor="accent5" w:themeTint="99"/>
-          <w:sz w:val="32"/>
-          <w:szCs w:val="32"/>
-        </w:rPr>
-        <w:t xml:space="preserve"> </w:t>
-      </w:r>
-      <w:r>
-        <w:rPr>
-          <w:rFonts w:cs="Carlito"/>
-          <w:b/>
-          <w:bCs/>
-          <w:color w:val="D86DCB" w:themeColor="accent5" w:themeTint="99"/>
-          <w:sz w:val="32"/>
-          <w:szCs w:val="32"/>
-        </w:rPr>
-        <w:t># 130</w:t>
+        <w:t>()) # 130</w:t>
       </w:r>
     </w:p>
     <w:p>
@@ -20916,15 +20978,7 @@
           <w:sz w:val="32"/>
           <w:szCs w:val="32"/>
         </w:rPr>
-        <w:t>Pythons</w:t>
-      </w:r>
-      <w:r>
-        <w:rPr>
-          <w:rFonts w:cs="Carlito"/>
-          <w:sz w:val="32"/>
-          <w:szCs w:val="32"/>
-        </w:rPr>
-        <w:t xml:space="preserve"> @decorator</w:t>
+        <w:t>Pythons @decorator</w:t>
       </w:r>
       <w:r>
         <w:rPr>
@@ -21417,156 +21471,6 @@
           <w:szCs w:val="32"/>
         </w:rPr>
       </w:pPr>
-    </w:p>
-    <w:p>
-      <w:pPr>
-        <w:jc w:val="both"/>
-        <w:rPr>
-          <w:rFonts w:cs="Carlito"/>
-          <w:b/>
-          <w:bCs/>
-          <w:sz w:val="32"/>
-          <w:szCs w:val="32"/>
-        </w:rPr>
-      </w:pPr>
-      <w:r>
-        <w:rPr>
-          <w:rFonts w:cs="Carlito"/>
-          <w:b/>
-          <w:bCs/>
-          <w:sz w:val="32"/>
-          <w:szCs w:val="32"/>
-        </w:rPr>
-        <w:t>D</w:t>
-      </w:r>
-      <w:r>
-        <w:rPr>
-          <w:rFonts w:cs="Carlito"/>
-          <w:b/>
-          <w:bCs/>
-          <w:sz w:val="32"/>
-          <w:szCs w:val="32"/>
-        </w:rPr>
-        <w:t>I</w:t>
-      </w:r>
-      <w:r>
-        <w:rPr>
-          <w:rFonts w:cs="Carlito"/>
-          <w:b/>
-          <w:bCs/>
-          <w:sz w:val="32"/>
-          <w:szCs w:val="32"/>
-        </w:rPr>
-        <w:t xml:space="preserve"> Pattern in Python:</w:t>
-      </w:r>
-    </w:p>
-    <w:p>
-      <w:pPr>
-        <w:jc w:val="both"/>
-        <w:rPr>
-          <w:rFonts w:cs="Carlito"/>
-          <w:sz w:val="32"/>
-          <w:szCs w:val="32"/>
-        </w:rPr>
-      </w:pPr>
-      <w:r>
-        <w:rPr>
-          <w:rFonts w:cs="Carlito"/>
-          <w:sz w:val="32"/>
-          <w:szCs w:val="32"/>
-        </w:rPr>
-        <w:t xml:space="preserve"># </w:t>
-      </w:r>
-      <w:r>
-        <w:rPr>
-          <w:rFonts w:cs="Carlito"/>
-          <w:sz w:val="32"/>
-          <w:szCs w:val="32"/>
-        </w:rPr>
-        <w:t>Dependency Injection is a technique where an object receives the dependencies it needs from the outside</w:t>
-      </w:r>
-      <w:r>
-        <w:rPr>
-          <w:rFonts w:cs="Carlito"/>
-          <w:sz w:val="32"/>
-          <w:szCs w:val="32"/>
-        </w:rPr>
-        <w:t xml:space="preserve"> (usually through constructor)</w:t>
-      </w:r>
-      <w:r>
-        <w:rPr>
-          <w:rFonts w:cs="Carlito"/>
-          <w:sz w:val="32"/>
-          <w:szCs w:val="32"/>
-        </w:rPr>
-        <w:t xml:space="preserve"> instead of creating those dependencies</w:t>
-      </w:r>
-      <w:r>
-        <w:rPr>
-          <w:rFonts w:cs="Carlito"/>
-          <w:sz w:val="32"/>
-          <w:szCs w:val="32"/>
-        </w:rPr>
-        <w:t xml:space="preserve"> in</w:t>
-      </w:r>
-      <w:r>
-        <w:rPr>
-          <w:rFonts w:cs="Carlito"/>
-          <w:sz w:val="32"/>
-          <w:szCs w:val="32"/>
-        </w:rPr>
-        <w:t xml:space="preserve"> itself</w:t>
-      </w:r>
-    </w:p>
-    <w:p>
-      <w:pPr>
-        <w:jc w:val="both"/>
-        <w:rPr>
-          <w:rFonts w:cs="Carlito"/>
-          <w:sz w:val="32"/>
-          <w:szCs w:val="32"/>
-        </w:rPr>
-      </w:pPr>
-      <w:r>
-        <w:rPr>
-          <w:rFonts w:cs="Carlito"/>
-          <w:sz w:val="32"/>
-          <w:szCs w:val="32"/>
-        </w:rPr>
-        <w:t xml:space="preserve"># </w:t>
-      </w:r>
-      <w:r>
-        <w:rPr>
-          <w:rFonts w:cs="Carlito"/>
-          <w:sz w:val="32"/>
-          <w:szCs w:val="32"/>
-        </w:rPr>
-        <w:t>The key idea is simply</w:t>
-      </w:r>
-      <w:r>
-        <w:rPr>
-          <w:rFonts w:cs="Carlito"/>
-          <w:sz w:val="32"/>
-          <w:szCs w:val="32"/>
-        </w:rPr>
-        <w:t xml:space="preserve"> “</w:t>
-      </w:r>
-      <w:r>
-        <w:rPr>
-          <w:rFonts w:cs="Carlito"/>
-          <w:sz w:val="32"/>
-          <w:szCs w:val="32"/>
-        </w:rPr>
-        <w:t>Don't create your dependencies inside the class. Give them to the class</w:t>
-      </w:r>
-      <w:r>
-        <w:rPr>
-          <w:rFonts w:cs="Carlito"/>
-          <w:sz w:val="32"/>
-          <w:szCs w:val="32"/>
-        </w:rPr>
-        <w:t>”</w:t>
-      </w:r>
     </w:p>
     <w:p>
       <w:pPr>
@@ -24202,6 +24106,7 @@
   <w:style w:type="character" w:default="1" w:styleId="DefaultParagraphFont">
     <w:name w:val="Default Paragraph Font"/>
     <w:uiPriority w:val="1"/>
+    <w:semiHidden/>
     <w:unhideWhenUsed/>
   </w:style>
   <w:style w:type="table" w:default="1" w:styleId="TableNormal">

</xml_diff>